<commit_message>
versión 4 del parcial 1
</commit_message>
<xml_diff>
--- a/3_paciales/1_parcial/Parcial1_Programacion_Python_v2.docx
+++ b/3_paciales/1_parcial/Parcial1_Programacion_Python_v2.docx
@@ -700,13 +700,23 @@
       <w:pPr>
         <w:spacing w:after="120"/>
       </w:pPr>
-      <w:r>
-        <w:rPr>
-          <w:rFonts w:ascii="Calibri" w:eastAsia="Calibri" w:hAnsi="Calibri" w:cs="Calibri"/>
-          <w:sz w:val="22"/>
-          <w:szCs w:val="22"/>
-        </w:rPr>
-        <w:t>Total obligatorio: 15 ítems, 100 puntos, ≈107 minutos de trabajo efectivo + 13 min de holgura/revisión. El reto (bloque D) es adicional y no resta tiempo del cálculo anterior; se ofrece para quien termine antes.</w:t>
+      <w:proofErr w:type="gramStart"/>
+      <w:r>
+        <w:rPr>
+          <w:rFonts w:ascii="Calibri" w:eastAsia="Calibri" w:hAnsi="Calibri" w:cs="Calibri"/>
+          <w:sz w:val="22"/>
+          <w:szCs w:val="22"/>
+        </w:rPr>
+        <w:t>Total</w:t>
+      </w:r>
+      <w:proofErr w:type="gramEnd"/>
+      <w:r>
+        <w:rPr>
+          <w:rFonts w:ascii="Calibri" w:eastAsia="Calibri" w:hAnsi="Calibri" w:cs="Calibri"/>
+          <w:sz w:val="22"/>
+          <w:szCs w:val="22"/>
+        </w:rPr>
+        <w:t xml:space="preserve"> obligatorio: 15 ítems, 100 puntos, ≈107 minutos de trabajo efectivo + 13 min de holgura/revisión. El reto (bloque D) es adicional y no resta tiempo del cálculo anterior; se ofrece para quien termine antes.</w:t>
       </w:r>
     </w:p>
     <w:p>
@@ -829,7 +839,27 @@
                 <w:bCs/>
                 <w:color w:val="FFFFFF"/>
               </w:rPr>
-              <w:t>Relacionales/asign.</w:t>
+              <w:t>Relacionales/</w:t>
+            </w:r>
+            <w:proofErr w:type="spellStart"/>
+            <w:r>
+              <w:rPr>
+                <w:rFonts w:ascii="Calibri" w:eastAsia="Calibri" w:hAnsi="Calibri" w:cs="Calibri"/>
+                <w:b/>
+                <w:bCs/>
+                <w:color w:val="FFFFFF"/>
+              </w:rPr>
+              <w:t>asign</w:t>
+            </w:r>
+            <w:proofErr w:type="spellEnd"/>
+            <w:r>
+              <w:rPr>
+                <w:rFonts w:ascii="Calibri" w:eastAsia="Calibri" w:hAnsi="Calibri" w:cs="Calibri"/>
+                <w:b/>
+                <w:bCs/>
+                <w:color w:val="FFFFFF"/>
+              </w:rPr>
+              <w:t>.</w:t>
             </w:r>
           </w:p>
         </w:tc>
@@ -1336,7 +1366,25 @@
           <w:sz w:val="22"/>
           <w:szCs w:val="22"/>
         </w:rPr>
-        <w:t>Este parcial está organizado en situaciones reales; lea el contexto completo antes de responder cada sub-pregunta.</w:t>
+        <w:t xml:space="preserve">Este parcial está organizado en situaciones reales; lea el contexto completo antes de responder cada </w:t>
+      </w:r>
+      <w:proofErr w:type="spellStart"/>
+      <w:r>
+        <w:rPr>
+          <w:rFonts w:ascii="Calibri" w:eastAsia="Calibri" w:hAnsi="Calibri" w:cs="Calibri"/>
+          <w:sz w:val="22"/>
+          <w:szCs w:val="22"/>
+        </w:rPr>
+        <w:t>sub-pregunta</w:t>
+      </w:r>
+      <w:proofErr w:type="spellEnd"/>
+      <w:r>
+        <w:rPr>
+          <w:rFonts w:ascii="Calibri" w:eastAsia="Calibri" w:hAnsi="Calibri" w:cs="Calibri"/>
+          <w:sz w:val="22"/>
+          <w:szCs w:val="22"/>
+        </w:rPr>
+        <w:t>.</w:t>
       </w:r>
     </w:p>
     <w:p>
@@ -1354,7 +1402,25 @@
           <w:sz w:val="22"/>
           <w:szCs w:val="22"/>
         </w:rPr>
-        <w:t>En el bloque A, marque V o F y justifique en una línea; una respuesta sin justificación no obtiene puntaje aunque la marca sea correcta.</w:t>
+        <w:t xml:space="preserve">En el bloque A, marque V o F y justifique en una línea; una respuesta sin justificación no obtiene </w:t>
+      </w:r>
+      <w:proofErr w:type="gramStart"/>
+      <w:r>
+        <w:rPr>
+          <w:rFonts w:ascii="Calibri" w:eastAsia="Calibri" w:hAnsi="Calibri" w:cs="Calibri"/>
+          <w:sz w:val="22"/>
+          <w:szCs w:val="22"/>
+        </w:rPr>
+        <w:t>puntaje</w:t>
+      </w:r>
+      <w:proofErr w:type="gramEnd"/>
+      <w:r>
+        <w:rPr>
+          <w:rFonts w:ascii="Calibri" w:eastAsia="Calibri" w:hAnsi="Calibri" w:cs="Calibri"/>
+          <w:sz w:val="22"/>
+          <w:szCs w:val="22"/>
+        </w:rPr>
+        <w:t xml:space="preserve"> aunque la marca sea correcta.</w:t>
       </w:r>
     </w:p>
     <w:p>
@@ -1390,7 +1456,43 @@
           <w:sz w:val="22"/>
           <w:szCs w:val="22"/>
         </w:rPr>
-        <w:t>Puede resolver mentalmente y transcribir, o usar directamente Jupyter/Colab si su profesor lo permite.</w:t>
+        <w:t xml:space="preserve">Puede resolver mentalmente y transcribir, o usar directamente </w:t>
+      </w:r>
+      <w:proofErr w:type="spellStart"/>
+      <w:r>
+        <w:rPr>
+          <w:rFonts w:ascii="Calibri" w:eastAsia="Calibri" w:hAnsi="Calibri" w:cs="Calibri"/>
+          <w:sz w:val="22"/>
+          <w:szCs w:val="22"/>
+        </w:rPr>
+        <w:t>Jupyter</w:t>
+      </w:r>
+      <w:proofErr w:type="spellEnd"/>
+      <w:r>
+        <w:rPr>
+          <w:rFonts w:ascii="Calibri" w:eastAsia="Calibri" w:hAnsi="Calibri" w:cs="Calibri"/>
+          <w:sz w:val="22"/>
+          <w:szCs w:val="22"/>
+        </w:rPr>
+        <w:t>/</w:t>
+      </w:r>
+      <w:proofErr w:type="spellStart"/>
+      <w:r>
+        <w:rPr>
+          <w:rFonts w:ascii="Calibri" w:eastAsia="Calibri" w:hAnsi="Calibri" w:cs="Calibri"/>
+          <w:sz w:val="22"/>
+          <w:szCs w:val="22"/>
+        </w:rPr>
+        <w:t>Colab</w:t>
+      </w:r>
+      <w:proofErr w:type="spellEnd"/>
+      <w:r>
+        <w:rPr>
+          <w:rFonts w:ascii="Calibri" w:eastAsia="Calibri" w:hAnsi="Calibri" w:cs="Calibri"/>
+          <w:sz w:val="22"/>
+          <w:szCs w:val="22"/>
+        </w:rPr>
+        <w:t xml:space="preserve"> si su profesor lo permite.</w:t>
       </w:r>
     </w:p>
     <w:p>
@@ -1510,7 +1612,15 @@
       </w:pPr>
       <w:r>
         <w:lastRenderedPageBreak/>
-        <w:t>Bloque A — Verdadero o Falso, justificado  (12 puntos · 1.5 c/u)</w:t>
+        <w:t xml:space="preserve">Bloque A — Verdadero o Falso, </w:t>
+      </w:r>
+      <w:proofErr w:type="gramStart"/>
+      <w:r>
+        <w:t>justificado  (</w:t>
+      </w:r>
+      <w:proofErr w:type="gramEnd"/>
+      <w:r>
+        <w:t>12 puntos · 1.5 c/u)</w:t>
       </w:r>
     </w:p>
     <w:p>
@@ -1541,7 +1651,25 @@
           <w:sz w:val="22"/>
           <w:szCs w:val="22"/>
         </w:rPr>
-        <w:t>A1. La expresión 7 / 2 en Python devuelve un int.</w:t>
+        <w:t xml:space="preserve">A1. La expresión 7 / 2 en Python devuelve un </w:t>
+      </w:r>
+      <w:proofErr w:type="spellStart"/>
+      <w:r>
+        <w:rPr>
+          <w:rFonts w:ascii="Calibri" w:eastAsia="Calibri" w:hAnsi="Calibri" w:cs="Calibri"/>
+          <w:sz w:val="22"/>
+          <w:szCs w:val="22"/>
+        </w:rPr>
+        <w:t>int</w:t>
+      </w:r>
+      <w:proofErr w:type="spellEnd"/>
+      <w:r>
+        <w:rPr>
+          <w:rFonts w:ascii="Calibri" w:eastAsia="Calibri" w:hAnsi="Calibri" w:cs="Calibri"/>
+          <w:sz w:val="22"/>
+          <w:szCs w:val="22"/>
+        </w:rPr>
+        <w:t>.</w:t>
       </w:r>
     </w:p>
     <w:p>
@@ -1595,7 +1723,25 @@
           <w:sz w:val="22"/>
           <w:szCs w:val="22"/>
         </w:rPr>
-        <w:t>A4. Si a = [1, 2] y b = a, entonces a is b es True.</w:t>
+        <w:t xml:space="preserve">A4. Si a = [1, 2] y b = a, entonces a </w:t>
+      </w:r>
+      <w:proofErr w:type="spellStart"/>
+      <w:r>
+        <w:rPr>
+          <w:rFonts w:ascii="Calibri" w:eastAsia="Calibri" w:hAnsi="Calibri" w:cs="Calibri"/>
+          <w:sz w:val="22"/>
+          <w:szCs w:val="22"/>
+        </w:rPr>
+        <w:t>is</w:t>
+      </w:r>
+      <w:proofErr w:type="spellEnd"/>
+      <w:r>
+        <w:rPr>
+          <w:rFonts w:ascii="Calibri" w:eastAsia="Calibri" w:hAnsi="Calibri" w:cs="Calibri"/>
+          <w:sz w:val="22"/>
+          <w:szCs w:val="22"/>
+        </w:rPr>
+        <w:t xml:space="preserve"> b es True.</w:t>
       </w:r>
     </w:p>
     <w:p>
@@ -1617,7 +1763,47 @@
           <w:szCs w:val="22"/>
           <w:lang w:val="en-US"/>
         </w:rPr>
-        <w:t>A5. La expresión not True and False es equivalente a not (True and False).</w:t>
+        <w:t xml:space="preserve">A5. La </w:t>
+      </w:r>
+      <w:proofErr w:type="spellStart"/>
+      <w:r>
+        <w:rPr>
+          <w:rFonts w:ascii="Calibri" w:eastAsia="Calibri" w:hAnsi="Calibri" w:cs="Calibri"/>
+          <w:sz w:val="22"/>
+          <w:szCs w:val="22"/>
+          <w:lang w:val="en-US"/>
+        </w:rPr>
+        <w:t>expresión</w:t>
+      </w:r>
+      <w:proofErr w:type="spellEnd"/>
+      <w:r>
+        <w:rPr>
+          <w:rFonts w:ascii="Calibri" w:eastAsia="Calibri" w:hAnsi="Calibri" w:cs="Calibri"/>
+          <w:sz w:val="22"/>
+          <w:szCs w:val="22"/>
+          <w:lang w:val="en-US"/>
+        </w:rPr>
+        <w:t xml:space="preserve"> not True and False es </w:t>
+      </w:r>
+      <w:proofErr w:type="spellStart"/>
+      <w:r>
+        <w:rPr>
+          <w:rFonts w:ascii="Calibri" w:eastAsia="Calibri" w:hAnsi="Calibri" w:cs="Calibri"/>
+          <w:sz w:val="22"/>
+          <w:szCs w:val="22"/>
+          <w:lang w:val="en-US"/>
+        </w:rPr>
+        <w:t>equivalente</w:t>
+      </w:r>
+      <w:proofErr w:type="spellEnd"/>
+      <w:r>
+        <w:rPr>
+          <w:rFonts w:ascii="Calibri" w:eastAsia="Calibri" w:hAnsi="Calibri" w:cs="Calibri"/>
+          <w:sz w:val="22"/>
+          <w:szCs w:val="22"/>
+          <w:lang w:val="en-US"/>
+        </w:rPr>
+        <w:t xml:space="preserve"> a not (True and False).</w:t>
       </w:r>
     </w:p>
     <w:p>
@@ -1671,8 +1857,717 @@
           <w:sz w:val="22"/>
           <w:szCs w:val="22"/>
         </w:rPr>
-        <w:t>A8. Dos objetos pueden ser iguales con == y, al mismo tiempo, no ser idénticos con is.</w:t>
-      </w:r>
+        <w:t xml:space="preserve">A8. Dos objetos pueden ser iguales con == y, al mismo tiempo, no ser idénticos con </w:t>
+      </w:r>
+      <w:proofErr w:type="spellStart"/>
+      <w:r>
+        <w:rPr>
+          <w:rFonts w:ascii="Calibri" w:eastAsia="Calibri" w:hAnsi="Calibri" w:cs="Calibri"/>
+          <w:sz w:val="22"/>
+          <w:szCs w:val="22"/>
+        </w:rPr>
+        <w:t>is</w:t>
+      </w:r>
+      <w:proofErr w:type="spellEnd"/>
+      <w:r>
+        <w:rPr>
+          <w:rFonts w:ascii="Calibri" w:eastAsia="Calibri" w:hAnsi="Calibri" w:cs="Calibri"/>
+          <w:sz w:val="22"/>
+          <w:szCs w:val="22"/>
+        </w:rPr>
+        <w:t>.</w:t>
+      </w:r>
+      <w:r>
+        <w:rPr>
+          <w:rFonts w:ascii="Calibri" w:eastAsia="Calibri" w:hAnsi="Calibri" w:cs="Calibri"/>
+          <w:sz w:val="22"/>
+          <w:szCs w:val="22"/>
+        </w:rPr>
+        <w:t xml:space="preserve">  </w:t>
+      </w:r>
+    </w:p>
+    <w:p>
+      <w:pPr>
+        <w:spacing w:after="60"/>
+        <w:rPr>
+          <w:b/>
+          <w:bCs/>
+        </w:rPr>
+      </w:pPr>
+      <w:r>
+        <w:t xml:space="preserve">Respuesta de A8:  </w:t>
+      </w:r>
+      <w:r>
+        <w:rPr>
+          <w:b/>
+          <w:bCs/>
+        </w:rPr>
+        <w:t>Resolución</w:t>
+      </w:r>
+    </w:p>
+    <w:p>
+      <w:pPr>
+        <w:spacing w:after="60"/>
+      </w:pPr>
+      <w:r>
+        <w:t xml:space="preserve">Esta afirmación es </w:t>
+      </w:r>
+      <w:r>
+        <w:rPr>
+          <w:b/>
+          <w:bCs/>
+        </w:rPr>
+        <w:t>verdadera</w:t>
+      </w:r>
+      <w:r>
+        <w:t xml:space="preserve"> en Python, y es un concepto fundamental para entender cómo funciona la comparación de objetos.</w:t>
+      </w:r>
+    </w:p>
+    <w:p>
+      <w:pPr>
+        <w:spacing w:after="60"/>
+        <w:rPr>
+          <w:b/>
+          <w:bCs/>
+        </w:rPr>
+      </w:pPr>
+      <w:r>
+        <w:rPr>
+          <w:b/>
+          <w:bCs/>
+        </w:rPr>
+        <w:t>La diferencia clave</w:t>
+      </w:r>
+    </w:p>
+    <w:p>
+      <w:pPr>
+        <w:numPr>
+          <w:ilvl w:val="0"/>
+          <w:numId w:val="3"/>
+        </w:numPr>
+        <w:spacing w:after="60"/>
+      </w:pPr>
+      <w:r>
+        <w:rPr>
+          <w:b/>
+          <w:bCs/>
+        </w:rPr>
+        <w:t>==</w:t>
+      </w:r>
+      <w:r>
+        <w:t xml:space="preserve"> compara </w:t>
+      </w:r>
+      <w:r>
+        <w:rPr>
+          <w:b/>
+          <w:bCs/>
+        </w:rPr>
+        <w:t>igualdad de valor</w:t>
+      </w:r>
+      <w:r>
+        <w:t xml:space="preserve"> (equivalencia): pregunta "¿estos objetos tienen el mismo contenido/valor?"</w:t>
+      </w:r>
+    </w:p>
+    <w:p>
+      <w:pPr>
+        <w:numPr>
+          <w:ilvl w:val="0"/>
+          <w:numId w:val="3"/>
+        </w:numPr>
+        <w:spacing w:after="60"/>
+      </w:pPr>
+      <w:proofErr w:type="spellStart"/>
+      <w:r>
+        <w:rPr>
+          <w:b/>
+          <w:bCs/>
+        </w:rPr>
+        <w:t>is</w:t>
+      </w:r>
+      <w:proofErr w:type="spellEnd"/>
+      <w:r>
+        <w:t xml:space="preserve"> compara </w:t>
+      </w:r>
+      <w:r>
+        <w:rPr>
+          <w:b/>
+          <w:bCs/>
+        </w:rPr>
+        <w:t>identidad</w:t>
+      </w:r>
+      <w:r>
+        <w:t xml:space="preserve"> (misma referencia en memoria): pregunta "¿estas dos variables apuntan exactamente al mismo objeto en memoria?"</w:t>
+      </w:r>
+    </w:p>
+    <w:p>
+      <w:pPr>
+        <w:spacing w:after="60"/>
+      </w:pPr>
+      <w:r>
+        <w:t>Dos objetos pueden tener el mismo valor sin ser el mismo objeto físico en memoria.</w:t>
+      </w:r>
+    </w:p>
+    <w:p>
+      <w:pPr>
+        <w:spacing w:after="60"/>
+        <w:rPr>
+          <w:b/>
+          <w:bCs/>
+        </w:rPr>
+      </w:pPr>
+      <w:r>
+        <w:rPr>
+          <w:b/>
+          <w:bCs/>
+        </w:rPr>
+        <w:t>Ejemplo clásico</w:t>
+      </w:r>
+    </w:p>
+    <w:p>
+      <w:pPr>
+        <w:spacing w:after="60"/>
+      </w:pPr>
+      <w:r>
+        <w:t>a = [1, 2, 3]</w:t>
+      </w:r>
+    </w:p>
+    <w:p>
+      <w:pPr>
+        <w:spacing w:after="60"/>
+      </w:pPr>
+      <w:r>
+        <w:t>b = [1, 2, 3]</w:t>
+      </w:r>
+    </w:p>
+    <w:p>
+      <w:pPr>
+        <w:spacing w:after="60"/>
+      </w:pPr>
+    </w:p>
+    <w:p>
+      <w:pPr>
+        <w:spacing w:after="60"/>
+      </w:pPr>
+      <w:proofErr w:type="spellStart"/>
+      <w:proofErr w:type="gramStart"/>
+      <w:r>
+        <w:t>print</w:t>
+      </w:r>
+      <w:proofErr w:type="spellEnd"/>
+      <w:r>
+        <w:t>(</w:t>
+      </w:r>
+      <w:proofErr w:type="gramEnd"/>
+      <w:r>
+        <w:t xml:space="preserve">a == </w:t>
+      </w:r>
+      <w:proofErr w:type="gramStart"/>
+      <w:r>
+        <w:t xml:space="preserve">b)   </w:t>
+      </w:r>
+      <w:proofErr w:type="gramEnd"/>
+      <w:r>
+        <w:t xml:space="preserve"># </w:t>
+      </w:r>
+      <w:proofErr w:type="gramStart"/>
+      <w:r>
+        <w:t>True  -</w:t>
+      </w:r>
+      <w:proofErr w:type="gramEnd"/>
+      <w:r>
+        <w:t>&gt; tienen el mismo contenido</w:t>
+      </w:r>
+    </w:p>
+    <w:p>
+      <w:pPr>
+        <w:spacing w:after="60"/>
+      </w:pPr>
+      <w:proofErr w:type="spellStart"/>
+      <w:proofErr w:type="gramStart"/>
+      <w:r>
+        <w:t>print</w:t>
+      </w:r>
+      <w:proofErr w:type="spellEnd"/>
+      <w:r>
+        <w:t>(</w:t>
+      </w:r>
+      <w:proofErr w:type="gramEnd"/>
+      <w:r>
+        <w:t xml:space="preserve">a </w:t>
+      </w:r>
+      <w:proofErr w:type="spellStart"/>
+      <w:r>
+        <w:t>is</w:t>
+      </w:r>
+      <w:proofErr w:type="spellEnd"/>
+      <w:r>
+        <w:t xml:space="preserve"> </w:t>
+      </w:r>
+      <w:proofErr w:type="gramStart"/>
+      <w:r>
+        <w:t xml:space="preserve">b)   </w:t>
+      </w:r>
+      <w:proofErr w:type="gramEnd"/>
+      <w:r>
+        <w:t># False -&gt; son dos objetos distintos en memoria</w:t>
+      </w:r>
+    </w:p>
+    <w:p>
+      <w:pPr>
+        <w:spacing w:after="60"/>
+      </w:pPr>
+      <w:proofErr w:type="spellStart"/>
+      <w:r>
+        <w:t>print</w:t>
+      </w:r>
+      <w:proofErr w:type="spellEnd"/>
+      <w:r>
+        <w:t>(id(a</w:t>
+      </w:r>
+      <w:proofErr w:type="gramStart"/>
+      <w:r>
+        <w:t xml:space="preserve">))   </w:t>
+      </w:r>
+      <w:proofErr w:type="gramEnd"/>
+      <w:r>
+        <w:t xml:space="preserve"> # por ejemplo: 140234567891200</w:t>
+      </w:r>
+    </w:p>
+    <w:p>
+      <w:pPr>
+        <w:spacing w:after="60"/>
+      </w:pPr>
+      <w:proofErr w:type="spellStart"/>
+      <w:r>
+        <w:t>print</w:t>
+      </w:r>
+      <w:proofErr w:type="spellEnd"/>
+      <w:r>
+        <w:t>(id(b</w:t>
+      </w:r>
+      <w:proofErr w:type="gramStart"/>
+      <w:r>
+        <w:t xml:space="preserve">))   </w:t>
+      </w:r>
+      <w:proofErr w:type="gramEnd"/>
+      <w:r>
+        <w:t xml:space="preserve"> # por ejemplo: </w:t>
+      </w:r>
+      <w:proofErr w:type="gramStart"/>
+      <w:r>
+        <w:t>140234567891328  (</w:t>
+      </w:r>
+      <w:proofErr w:type="gramEnd"/>
+      <w:r>
+        <w:t>distinto)</w:t>
+      </w:r>
+    </w:p>
+    <w:p>
+      <w:pPr>
+        <w:spacing w:after="60"/>
+      </w:pPr>
+      <w:r>
+        <w:t xml:space="preserve">Aquí a y b son dos listas </w:t>
+      </w:r>
+      <w:r>
+        <w:rPr>
+          <w:b/>
+          <w:bCs/>
+        </w:rPr>
+        <w:t>diferentes</w:t>
+      </w:r>
+      <w:r>
+        <w:t xml:space="preserve">, creadas de forma independiente, que </w:t>
+      </w:r>
+      <w:r>
+        <w:rPr>
+          <w:b/>
+          <w:bCs/>
+        </w:rPr>
+        <w:t>casualmente</w:t>
+      </w:r>
+      <w:r>
+        <w:t xml:space="preserve"> contienen los mismos elementos. Python compara su contenido con == (usando el método __</w:t>
+      </w:r>
+      <w:proofErr w:type="spellStart"/>
+      <w:r>
+        <w:t>eq</w:t>
+      </w:r>
+      <w:proofErr w:type="spellEnd"/>
+      <w:r>
+        <w:t xml:space="preserve">__) y da True, pero como ocupan direcciones de memoria distintas, </w:t>
+      </w:r>
+      <w:proofErr w:type="spellStart"/>
+      <w:r>
+        <w:t>is</w:t>
+      </w:r>
+      <w:proofErr w:type="spellEnd"/>
+      <w:r>
+        <w:t xml:space="preserve"> da False.</w:t>
+      </w:r>
+    </w:p>
+    <w:p>
+      <w:pPr>
+        <w:spacing w:after="60"/>
+        <w:rPr>
+          <w:b/>
+          <w:bCs/>
+        </w:rPr>
+      </w:pPr>
+      <w:r>
+        <w:rPr>
+          <w:b/>
+          <w:bCs/>
+        </w:rPr>
+        <w:t>¿Por qué ocurre esto?</w:t>
+      </w:r>
+    </w:p>
+    <w:p>
+      <w:pPr>
+        <w:spacing w:after="60"/>
+      </w:pPr>
+      <w:r>
+        <w:t xml:space="preserve">Cuando escribes [1, 2, 3] dos veces, Python crea </w:t>
+      </w:r>
+      <w:r>
+        <w:rPr>
+          <w:b/>
+          <w:bCs/>
+        </w:rPr>
+        <w:t>dos objetos lista independientes</w:t>
+      </w:r>
+      <w:r>
+        <w:t xml:space="preserve"> en memoria, cada uno con su propia dirección. El operador == para listas está definido para comparar elemento por elemento, no para comparar si son "el mismo objeto físico".</w:t>
+      </w:r>
+    </w:p>
+    <w:p>
+      <w:pPr>
+        <w:spacing w:after="60"/>
+        <w:rPr>
+          <w:b/>
+          <w:bCs/>
+        </w:rPr>
+      </w:pPr>
+      <w:r>
+        <w:rPr>
+          <w:b/>
+          <w:bCs/>
+        </w:rPr>
+        <w:t>Caso contrario (para contraste)</w:t>
+      </w:r>
+    </w:p>
+    <w:p>
+      <w:pPr>
+        <w:spacing w:after="60"/>
+      </w:pPr>
+      <w:r>
+        <w:t>c = a</w:t>
+      </w:r>
+    </w:p>
+    <w:p>
+      <w:pPr>
+        <w:spacing w:after="60"/>
+      </w:pPr>
+      <w:proofErr w:type="spellStart"/>
+      <w:proofErr w:type="gramStart"/>
+      <w:r>
+        <w:t>print</w:t>
+      </w:r>
+      <w:proofErr w:type="spellEnd"/>
+      <w:r>
+        <w:t>(</w:t>
+      </w:r>
+      <w:proofErr w:type="gramEnd"/>
+      <w:r>
+        <w:t xml:space="preserve">c </w:t>
+      </w:r>
+      <w:proofErr w:type="spellStart"/>
+      <w:r>
+        <w:t>is</w:t>
+      </w:r>
+      <w:proofErr w:type="spellEnd"/>
+      <w:r>
+        <w:t xml:space="preserve"> </w:t>
+      </w:r>
+      <w:proofErr w:type="gramStart"/>
+      <w:r>
+        <w:t xml:space="preserve">a)   </w:t>
+      </w:r>
+      <w:proofErr w:type="gramEnd"/>
+      <w:r>
+        <w:t># True -&gt; c y a apuntan al mismo objeto</w:t>
+      </w:r>
+    </w:p>
+    <w:p>
+      <w:pPr>
+        <w:spacing w:after="60"/>
+      </w:pPr>
+      <w:r>
+        <w:t xml:space="preserve">Aquí c </w:t>
+      </w:r>
+      <w:proofErr w:type="spellStart"/>
+      <w:r>
+        <w:t>is</w:t>
+      </w:r>
+      <w:proofErr w:type="spellEnd"/>
+      <w:r>
+        <w:t xml:space="preserve"> a es True porque c no es una lista nueva, sino </w:t>
+      </w:r>
+      <w:r>
+        <w:rPr>
+          <w:b/>
+          <w:bCs/>
+        </w:rPr>
+        <w:t>otra etiqueta que apunta al mismo objeto</w:t>
+      </w:r>
+      <w:r>
+        <w:t xml:space="preserve"> que a.</w:t>
+      </w:r>
+    </w:p>
+    <w:p>
+      <w:pPr>
+        <w:spacing w:after="60"/>
+        <w:rPr>
+          <w:b/>
+          <w:bCs/>
+        </w:rPr>
+      </w:pPr>
+      <w:r>
+        <w:rPr>
+          <w:b/>
+          <w:bCs/>
+        </w:rPr>
+        <w:t xml:space="preserve">Caso especial: pequeños enteros y </w:t>
+      </w:r>
+      <w:proofErr w:type="spellStart"/>
+      <w:r>
+        <w:rPr>
+          <w:b/>
+          <w:bCs/>
+        </w:rPr>
+        <w:t>strings</w:t>
+      </w:r>
+      <w:proofErr w:type="spellEnd"/>
+    </w:p>
+    <w:p>
+      <w:pPr>
+        <w:spacing w:after="60"/>
+      </w:pPr>
+      <w:r>
+        <w:t>x = 5</w:t>
+      </w:r>
+    </w:p>
+    <w:p>
+      <w:pPr>
+        <w:spacing w:after="60"/>
+      </w:pPr>
+      <w:r>
+        <w:t>y = 5</w:t>
+      </w:r>
+    </w:p>
+    <w:p>
+      <w:pPr>
+        <w:spacing w:after="60"/>
+      </w:pPr>
+      <w:proofErr w:type="spellStart"/>
+      <w:proofErr w:type="gramStart"/>
+      <w:r>
+        <w:t>print</w:t>
+      </w:r>
+      <w:proofErr w:type="spellEnd"/>
+      <w:r>
+        <w:t>(</w:t>
+      </w:r>
+      <w:proofErr w:type="gramEnd"/>
+      <w:r>
+        <w:t xml:space="preserve">x </w:t>
+      </w:r>
+      <w:proofErr w:type="spellStart"/>
+      <w:r>
+        <w:t>is</w:t>
+      </w:r>
+      <w:proofErr w:type="spellEnd"/>
+      <w:r>
+        <w:t xml:space="preserve"> </w:t>
+      </w:r>
+      <w:proofErr w:type="gramStart"/>
+      <w:r>
+        <w:t xml:space="preserve">y)   </w:t>
+      </w:r>
+      <w:proofErr w:type="gramEnd"/>
+      <w:r>
+        <w:t># True (Python "cachea" enteros pequeños, -5 a 256)</w:t>
+      </w:r>
+    </w:p>
+    <w:p>
+      <w:pPr>
+        <w:spacing w:after="60"/>
+      </w:pPr>
+      <w:r>
+        <w:t xml:space="preserve">Esto puede confundir, porque para ciertos tipos inmutables pequeños, Python reutiliza el mismo objeto por optimización interna. Pero </w:t>
+      </w:r>
+      <w:r>
+        <w:rPr>
+          <w:b/>
+          <w:bCs/>
+        </w:rPr>
+        <w:t>no debes depender de este comportamiento</w:t>
+      </w:r>
+      <w:r>
+        <w:t xml:space="preserve">: es un detalle de implementación, no una garantía del lenguaje. Para objetos mutables (listas, diccionarios) o para instancias de clases personalizadas, == e </w:t>
+      </w:r>
+      <w:proofErr w:type="spellStart"/>
+      <w:r>
+        <w:t>is</w:t>
+      </w:r>
+      <w:proofErr w:type="spellEnd"/>
+      <w:r>
+        <w:t xml:space="preserve"> casi siempre difieren si se crean por separado.</w:t>
+      </w:r>
+    </w:p>
+    <w:p>
+      <w:pPr>
+        <w:spacing w:after="60"/>
+        <w:rPr>
+          <w:b/>
+          <w:bCs/>
+        </w:rPr>
+      </w:pPr>
+      <w:r>
+        <w:rPr>
+          <w:b/>
+          <w:bCs/>
+        </w:rPr>
+        <w:t>Conclusión / regla práctica</w:t>
+      </w:r>
+    </w:p>
+    <w:p>
+      <w:pPr>
+        <w:numPr>
+          <w:ilvl w:val="0"/>
+          <w:numId w:val="4"/>
+        </w:numPr>
+        <w:spacing w:after="60"/>
+      </w:pPr>
+      <w:r>
+        <w:lastRenderedPageBreak/>
+        <w:t xml:space="preserve">Usa </w:t>
+      </w:r>
+      <w:r>
+        <w:rPr>
+          <w:b/>
+          <w:bCs/>
+        </w:rPr>
+        <w:t>==</w:t>
+      </w:r>
+      <w:r>
+        <w:t xml:space="preserve"> cuando quieras saber si dos objetos </w:t>
+      </w:r>
+      <w:r>
+        <w:rPr>
+          <w:b/>
+          <w:bCs/>
+        </w:rPr>
+        <w:t>representan lo mismo</w:t>
+      </w:r>
+      <w:r>
+        <w:t xml:space="preserve"> (mismo valor).</w:t>
+      </w:r>
+    </w:p>
+    <w:p>
+      <w:pPr>
+        <w:numPr>
+          <w:ilvl w:val="0"/>
+          <w:numId w:val="4"/>
+        </w:numPr>
+        <w:spacing w:after="60"/>
+      </w:pPr>
+      <w:r>
+        <w:t xml:space="preserve">Usa </w:t>
+      </w:r>
+      <w:proofErr w:type="spellStart"/>
+      <w:r>
+        <w:rPr>
+          <w:b/>
+          <w:bCs/>
+        </w:rPr>
+        <w:t>is</w:t>
+      </w:r>
+      <w:proofErr w:type="spellEnd"/>
+      <w:r>
+        <w:t xml:space="preserve"> cuando quieras saber si dos variables </w:t>
+      </w:r>
+      <w:r>
+        <w:rPr>
+          <w:b/>
+          <w:bCs/>
+        </w:rPr>
+        <w:t>son literalmente el mismo objeto</w:t>
+      </w:r>
+      <w:r>
+        <w:t xml:space="preserve"> en memoria (uso típico: comparar con </w:t>
+      </w:r>
+      <w:proofErr w:type="spellStart"/>
+      <w:r>
+        <w:t>None</w:t>
+      </w:r>
+      <w:proofErr w:type="spellEnd"/>
+      <w:r>
+        <w:t xml:space="preserve">, por </w:t>
+      </w:r>
+      <w:proofErr w:type="gramStart"/>
+      <w:r>
+        <w:t>ejemplo</w:t>
+      </w:r>
+      <w:proofErr w:type="gramEnd"/>
+      <w:r>
+        <w:t xml:space="preserve"> </w:t>
+      </w:r>
+      <w:proofErr w:type="spellStart"/>
+      <w:r>
+        <w:t>if</w:t>
+      </w:r>
+      <w:proofErr w:type="spellEnd"/>
+      <w:r>
+        <w:t xml:space="preserve"> x </w:t>
+      </w:r>
+      <w:proofErr w:type="spellStart"/>
+      <w:r>
+        <w:t>is</w:t>
+      </w:r>
+      <w:proofErr w:type="spellEnd"/>
+      <w:r>
+        <w:t xml:space="preserve"> </w:t>
+      </w:r>
+      <w:proofErr w:type="spellStart"/>
+      <w:r>
+        <w:t>None</w:t>
+      </w:r>
+      <w:proofErr w:type="spellEnd"/>
+      <w:r>
+        <w:t>).</w:t>
+      </w:r>
+    </w:p>
+    <w:p>
+      <w:pPr>
+        <w:spacing w:after="60"/>
+      </w:pPr>
+      <w:r>
+        <w:t>La afirmación del enunciado es correcta: la igualdad de valor (==) no implica identidad de objeto (</w:t>
+      </w:r>
+      <w:proofErr w:type="spellStart"/>
+      <w:r>
+        <w:t>is</w:t>
+      </w:r>
+      <w:proofErr w:type="spellEnd"/>
+      <w:r>
+        <w:t>).</w:t>
+      </w:r>
+    </w:p>
+    <w:p>
+      <w:pPr>
+        <w:spacing w:after="60"/>
+      </w:pPr>
     </w:p>
     <w:p>
       <w:pPr>
@@ -1771,9 +2666,35 @@
         <w:pStyle w:val="Ttulo1"/>
         <w:spacing w:before="300" w:after="150"/>
       </w:pPr>
+    </w:p>
+    <w:p>
+      <w:pPr>
+        <w:pStyle w:val="Ttulo1"/>
+        <w:spacing w:before="300" w:after="150"/>
+      </w:pPr>
+    </w:p>
+    <w:p>
+      <w:pPr>
+        <w:pStyle w:val="Ttulo1"/>
+        <w:spacing w:before="300" w:after="150"/>
+      </w:pPr>
+    </w:p>
+    <w:p>
+      <w:pPr>
+        <w:pStyle w:val="Ttulo1"/>
+        <w:spacing w:before="300" w:after="150"/>
+      </w:pPr>
       <w:r>
         <w:lastRenderedPageBreak/>
-        <w:t>Bloque B — Detección y corrección de errores  (12 puntos · 6 c/u)</w:t>
+        <w:t xml:space="preserve">Bloque B — Detección y corrección de </w:t>
+      </w:r>
+      <w:proofErr w:type="gramStart"/>
+      <w:r>
+        <w:t>errores  (</w:t>
+      </w:r>
+      <w:proofErr w:type="gramEnd"/>
+      <w:r>
+        <w:t>12 puntos · 6 c/u)</w:t>
       </w:r>
     </w:p>
     <w:p>
@@ -1796,11 +2717,14 @@
         <w:shd w:val="clear" w:color="auto" w:fill="F2F2F2"/>
         <w:spacing w:before="60" w:after="120"/>
         <w:ind w:left="360"/>
-      </w:pPr>
-      <w:r>
         <w:rPr>
           <w:rFonts w:ascii="Consolas" w:eastAsia="Consolas" w:hAnsi="Consolas" w:cs="Consolas"/>
         </w:rPr>
+      </w:pPr>
+      <w:r>
+        <w:rPr>
+          <w:rFonts w:ascii="Consolas" w:eastAsia="Consolas" w:hAnsi="Consolas" w:cs="Consolas"/>
+        </w:rPr>
         <w:t>nota1 = 3.5</w:t>
       </w:r>
       <w:r>
@@ -1851,39 +2775,27 @@
       <w:r>
         <w:br/>
       </w:r>
+      <w:proofErr w:type="spellStart"/>
+      <w:proofErr w:type="gramStart"/>
       <w:r>
         <w:rPr>
           <w:rFonts w:ascii="Consolas" w:eastAsia="Consolas" w:hAnsi="Consolas" w:cs="Consolas"/>
         </w:rPr>
-        <w:t>print("Promedio:" promedio)</w:t>
-      </w:r>
-    </w:p>
-    <w:p>
-      <w:pPr>
-        <w:spacing w:after="120"/>
-      </w:pPr>
-      <w:r>
-        <w:rPr>
-          <w:rFonts w:ascii="Calibri" w:eastAsia="Calibri" w:hAnsi="Calibri" w:cs="Calibri"/>
-          <w:sz w:val="22"/>
-          <w:szCs w:val="22"/>
-        </w:rPr>
-        <w:t>Identifique las tres fallas (una de precedencia aritmética, una de operador de asignación vs. relacional, y una de sintaxis en print), explique cada una en una línea y escriba la versión corregida.</w:t>
-      </w:r>
-    </w:p>
-    <w:p>
-      <w:pPr>
-        <w:spacing w:after="120"/>
-      </w:pPr>
-      <w:r>
-        <w:rPr>
-          <w:rFonts w:ascii="Calibri" w:eastAsia="Calibri" w:hAnsi="Calibri" w:cs="Calibri"/>
-          <w:b/>
-          <w:bCs/>
-          <w:sz w:val="22"/>
-          <w:szCs w:val="22"/>
-        </w:rPr>
-        <w:t>B2. El siguiente código pretende verificar el acceso de un usuario a una plataforma, y por qué es un ejemplo típico de mal uso del argumento por defecto mutable:</w:t>
+        <w:t>print</w:t>
+      </w:r>
+      <w:proofErr w:type="spellEnd"/>
+      <w:r>
+        <w:rPr>
+          <w:rFonts w:ascii="Consolas" w:eastAsia="Consolas" w:hAnsi="Consolas" w:cs="Consolas"/>
+        </w:rPr>
+        <w:t>(</w:t>
+      </w:r>
+      <w:proofErr w:type="gramEnd"/>
+      <w:r>
+        <w:rPr>
+          <w:rFonts w:ascii="Consolas" w:eastAsia="Consolas" w:hAnsi="Consolas" w:cs="Consolas"/>
+        </w:rPr>
+        <w:t>"Promedio:" promedio)</w:t>
       </w:r>
     </w:p>
     <w:p>
@@ -1892,11 +2804,160 @@
         <w:spacing w:before="60" w:after="120"/>
         <w:ind w:left="360"/>
       </w:pPr>
+      <w:proofErr w:type="spellStart"/>
+      <w:proofErr w:type="gramStart"/>
       <w:r>
         <w:rPr>
           <w:rFonts w:ascii="Consolas" w:eastAsia="Consolas" w:hAnsi="Consolas" w:cs="Consolas"/>
         </w:rPr>
-        <w:t>def registrar_intento(usuario, historial=[]):</w:t>
+        <w:t>print</w:t>
+      </w:r>
+      <w:proofErr w:type="spellEnd"/>
+      <w:r>
+        <w:rPr>
+          <w:rFonts w:ascii="Consolas" w:eastAsia="Consolas" w:hAnsi="Consolas" w:cs="Consolas"/>
+        </w:rPr>
+        <w:t>(</w:t>
+      </w:r>
+      <w:proofErr w:type="gramEnd"/>
+      <w:r>
+        <w:rPr>
+          <w:rFonts w:ascii="Consolas" w:eastAsia="Consolas" w:hAnsi="Consolas" w:cs="Consolas"/>
+        </w:rPr>
+        <w:t>"</w:t>
+      </w:r>
+      <w:r>
+        <w:rPr>
+          <w:rFonts w:ascii="Consolas" w:eastAsia="Consolas" w:hAnsi="Consolas" w:cs="Consolas"/>
+        </w:rPr>
+        <w:t>Aprueba</w:t>
+      </w:r>
+      <w:r>
+        <w:rPr>
+          <w:rFonts w:ascii="Consolas" w:eastAsia="Consolas" w:hAnsi="Consolas" w:cs="Consolas"/>
+        </w:rPr>
+        <w:t xml:space="preserve">:" </w:t>
+      </w:r>
+      <w:r>
+        <w:rPr>
+          <w:rFonts w:ascii="Consolas" w:eastAsia="Consolas" w:hAnsi="Consolas" w:cs="Consolas"/>
+        </w:rPr>
+        <w:t>aprueba</w:t>
+      </w:r>
+      <w:r>
+        <w:rPr>
+          <w:rFonts w:ascii="Consolas" w:eastAsia="Consolas" w:hAnsi="Consolas" w:cs="Consolas"/>
+        </w:rPr>
+        <w:t>)</w:t>
+      </w:r>
+    </w:p>
+    <w:p>
+      <w:pPr>
+        <w:spacing w:after="120"/>
+      </w:pPr>
+      <w:r>
+        <w:rPr>
+          <w:rFonts w:ascii="Calibri" w:eastAsia="Calibri" w:hAnsi="Calibri" w:cs="Calibri"/>
+          <w:sz w:val="22"/>
+          <w:szCs w:val="22"/>
+        </w:rPr>
+        <w:t xml:space="preserve">Identifique las tres fallas (una de precedencia aritmética, una de operador de asignación vs. relacional, y una de sintaxis en </w:t>
+      </w:r>
+      <w:proofErr w:type="spellStart"/>
+      <w:r>
+        <w:rPr>
+          <w:rFonts w:ascii="Calibri" w:eastAsia="Calibri" w:hAnsi="Calibri" w:cs="Calibri"/>
+          <w:sz w:val="22"/>
+          <w:szCs w:val="22"/>
+        </w:rPr>
+        <w:t>print</w:t>
+      </w:r>
+      <w:proofErr w:type="spellEnd"/>
+      <w:r>
+        <w:rPr>
+          <w:rFonts w:ascii="Calibri" w:eastAsia="Calibri" w:hAnsi="Calibri" w:cs="Calibri"/>
+          <w:sz w:val="22"/>
+          <w:szCs w:val="22"/>
+        </w:rPr>
+        <w:t>), explique cada una en una línea y escriba la versión corregida.</w:t>
+      </w:r>
+    </w:p>
+    <w:p>
+      <w:pPr>
+        <w:spacing w:after="120"/>
+      </w:pPr>
+      <w:r>
+        <w:rPr>
+          <w:rFonts w:ascii="Calibri" w:eastAsia="Calibri" w:hAnsi="Calibri" w:cs="Calibri"/>
+          <w:b/>
+          <w:bCs/>
+          <w:sz w:val="22"/>
+          <w:szCs w:val="22"/>
+        </w:rPr>
+        <w:t>B2. El siguiente código pretende verificar el acceso de un usuario a una plataforma, y por qué es un ejemplo típico de mal uso del argumento por defecto mutable:</w:t>
+      </w:r>
+    </w:p>
+    <w:p>
+      <w:pPr>
+        <w:shd w:val="clear" w:color="auto" w:fill="F2F2F2"/>
+        <w:spacing w:before="60" w:after="120"/>
+        <w:ind w:left="360"/>
+      </w:pPr>
+      <w:proofErr w:type="spellStart"/>
+      <w:r>
+        <w:rPr>
+          <w:rFonts w:ascii="Consolas" w:eastAsia="Consolas" w:hAnsi="Consolas" w:cs="Consolas"/>
+        </w:rPr>
+        <w:t>def</w:t>
+      </w:r>
+      <w:proofErr w:type="spellEnd"/>
+      <w:r>
+        <w:rPr>
+          <w:rFonts w:ascii="Consolas" w:eastAsia="Consolas" w:hAnsi="Consolas" w:cs="Consolas"/>
+        </w:rPr>
+        <w:t xml:space="preserve"> </w:t>
+      </w:r>
+      <w:proofErr w:type="spellStart"/>
+      <w:r>
+        <w:rPr>
+          <w:rFonts w:ascii="Consolas" w:eastAsia="Consolas" w:hAnsi="Consolas" w:cs="Consolas"/>
+        </w:rPr>
+        <w:t>registrar_</w:t>
+      </w:r>
+      <w:proofErr w:type="gramStart"/>
+      <w:r>
+        <w:rPr>
+          <w:rFonts w:ascii="Consolas" w:eastAsia="Consolas" w:hAnsi="Consolas" w:cs="Consolas"/>
+        </w:rPr>
+        <w:t>intento</w:t>
+      </w:r>
+      <w:proofErr w:type="spellEnd"/>
+      <w:r>
+        <w:rPr>
+          <w:rFonts w:ascii="Consolas" w:eastAsia="Consolas" w:hAnsi="Consolas" w:cs="Consolas"/>
+        </w:rPr>
+        <w:t>(</w:t>
+      </w:r>
+      <w:proofErr w:type="gramEnd"/>
+      <w:r>
+        <w:rPr>
+          <w:rFonts w:ascii="Consolas" w:eastAsia="Consolas" w:hAnsi="Consolas" w:cs="Consolas"/>
+        </w:rPr>
+        <w:t>usuario, historial</w:t>
+      </w:r>
+      <w:proofErr w:type="gramStart"/>
+      <w:r>
+        <w:rPr>
+          <w:rFonts w:ascii="Consolas" w:eastAsia="Consolas" w:hAnsi="Consolas" w:cs="Consolas"/>
+        </w:rPr>
+        <w:t>=[</w:t>
+      </w:r>
+      <w:proofErr w:type="gramEnd"/>
+      <w:r>
+        <w:rPr>
+          <w:rFonts w:ascii="Consolas" w:eastAsia="Consolas" w:hAnsi="Consolas" w:cs="Consolas"/>
+        </w:rPr>
+        <w:t>]):</w:t>
       </w:r>
       <w:r>
         <w:br/>
@@ -1905,7 +2966,23 @@
         <w:rPr>
           <w:rFonts w:ascii="Consolas" w:eastAsia="Consolas" w:hAnsi="Consolas" w:cs="Consolas"/>
         </w:rPr>
-        <w:t xml:space="preserve">    historial.append(usuario)</w:t>
+        <w:t xml:space="preserve">    </w:t>
+      </w:r>
+      <w:proofErr w:type="spellStart"/>
+      <w:proofErr w:type="gramStart"/>
+      <w:r>
+        <w:rPr>
+          <w:rFonts w:ascii="Consolas" w:eastAsia="Consolas" w:hAnsi="Consolas" w:cs="Consolas"/>
+        </w:rPr>
+        <w:t>historial.append</w:t>
+      </w:r>
+      <w:proofErr w:type="spellEnd"/>
+      <w:proofErr w:type="gramEnd"/>
+      <w:r>
+        <w:rPr>
+          <w:rFonts w:ascii="Consolas" w:eastAsia="Consolas" w:hAnsi="Consolas" w:cs="Consolas"/>
+        </w:rPr>
+        <w:t>(usuario)</w:t>
       </w:r>
       <w:r>
         <w:br/>
@@ -1914,7 +2991,21 @@
         <w:rPr>
           <w:rFonts w:ascii="Consolas" w:eastAsia="Consolas" w:hAnsi="Consolas" w:cs="Consolas"/>
         </w:rPr>
-        <w:t xml:space="preserve">    return historial</w:t>
+        <w:t xml:space="preserve">    </w:t>
+      </w:r>
+      <w:proofErr w:type="spellStart"/>
+      <w:r>
+        <w:rPr>
+          <w:rFonts w:ascii="Consolas" w:eastAsia="Consolas" w:hAnsi="Consolas" w:cs="Consolas"/>
+        </w:rPr>
+        <w:t>return</w:t>
+      </w:r>
+      <w:proofErr w:type="spellEnd"/>
+      <w:r>
+        <w:rPr>
+          <w:rFonts w:ascii="Consolas" w:eastAsia="Consolas" w:hAnsi="Consolas" w:cs="Consolas"/>
+        </w:rPr>
+        <w:t xml:space="preserve"> historial</w:t>
       </w:r>
       <w:r>
         <w:br/>
@@ -1922,20 +3013,92 @@
       <w:r>
         <w:br/>
       </w:r>
+      <w:proofErr w:type="spellStart"/>
       <w:r>
         <w:rPr>
           <w:rFonts w:ascii="Consolas" w:eastAsia="Consolas" w:hAnsi="Consolas" w:cs="Consolas"/>
         </w:rPr>
-        <w:t>print(registrar_intento("ana"))</w:t>
+        <w:t>print</w:t>
+      </w:r>
+      <w:proofErr w:type="spellEnd"/>
+      <w:r>
+        <w:rPr>
+          <w:rFonts w:ascii="Consolas" w:eastAsia="Consolas" w:hAnsi="Consolas" w:cs="Consolas"/>
+        </w:rPr>
+        <w:t>(</w:t>
+      </w:r>
+      <w:proofErr w:type="spellStart"/>
+      <w:r>
+        <w:rPr>
+          <w:rFonts w:ascii="Consolas" w:eastAsia="Consolas" w:hAnsi="Consolas" w:cs="Consolas"/>
+        </w:rPr>
+        <w:t>registrar_intento</w:t>
+      </w:r>
+      <w:proofErr w:type="spellEnd"/>
+      <w:r>
+        <w:rPr>
+          <w:rFonts w:ascii="Consolas" w:eastAsia="Consolas" w:hAnsi="Consolas" w:cs="Consolas"/>
+        </w:rPr>
+        <w:t>("</w:t>
+      </w:r>
+      <w:proofErr w:type="spellStart"/>
+      <w:r>
+        <w:rPr>
+          <w:rFonts w:ascii="Consolas" w:eastAsia="Consolas" w:hAnsi="Consolas" w:cs="Consolas"/>
+        </w:rPr>
+        <w:t>ana</w:t>
+      </w:r>
+      <w:proofErr w:type="spellEnd"/>
+      <w:r>
+        <w:rPr>
+          <w:rFonts w:ascii="Consolas" w:eastAsia="Consolas" w:hAnsi="Consolas" w:cs="Consolas"/>
+        </w:rPr>
+        <w:t>"))</w:t>
       </w:r>
       <w:r>
         <w:br/>
       </w:r>
+      <w:proofErr w:type="spellStart"/>
       <w:r>
         <w:rPr>
           <w:rFonts w:ascii="Consolas" w:eastAsia="Consolas" w:hAnsi="Consolas" w:cs="Consolas"/>
         </w:rPr>
-        <w:t>print(registrar_intento("luis"))</w:t>
+        <w:t>print</w:t>
+      </w:r>
+      <w:proofErr w:type="spellEnd"/>
+      <w:r>
+        <w:rPr>
+          <w:rFonts w:ascii="Consolas" w:eastAsia="Consolas" w:hAnsi="Consolas" w:cs="Consolas"/>
+        </w:rPr>
+        <w:t>(</w:t>
+      </w:r>
+      <w:proofErr w:type="spellStart"/>
+      <w:r>
+        <w:rPr>
+          <w:rFonts w:ascii="Consolas" w:eastAsia="Consolas" w:hAnsi="Consolas" w:cs="Consolas"/>
+        </w:rPr>
+        <w:t>registrar_intento</w:t>
+      </w:r>
+      <w:proofErr w:type="spellEnd"/>
+      <w:r>
+        <w:rPr>
+          <w:rFonts w:ascii="Consolas" w:eastAsia="Consolas" w:hAnsi="Consolas" w:cs="Consolas"/>
+        </w:rPr>
+        <w:t>("</w:t>
+      </w:r>
+      <w:proofErr w:type="spellStart"/>
+      <w:r>
+        <w:rPr>
+          <w:rFonts w:ascii="Consolas" w:eastAsia="Consolas" w:hAnsi="Consolas" w:cs="Consolas"/>
+        </w:rPr>
+        <w:t>luis</w:t>
+      </w:r>
+      <w:proofErr w:type="spellEnd"/>
+      <w:r>
+        <w:rPr>
+          <w:rFonts w:ascii="Consolas" w:eastAsia="Consolas" w:hAnsi="Consolas" w:cs="Consolas"/>
+        </w:rPr>
+        <w:t>"))</w:t>
       </w:r>
     </w:p>
     <w:p>
@@ -1960,6 +3123,818 @@
       </w:pPr>
     </w:p>
     <w:p>
+      <w:pPr>
+        <w:rPr>
+          <w:b/>
+          <w:bCs/>
+        </w:rPr>
+      </w:pPr>
+      <w:r>
+        <w:rPr>
+          <w:b/>
+          <w:bCs/>
+        </w:rPr>
+        <w:t>Qué imprime realmente</w:t>
+      </w:r>
+    </w:p>
+    <w:p>
+      <w:proofErr w:type="spellStart"/>
+      <w:r>
+        <w:t>print</w:t>
+      </w:r>
+      <w:proofErr w:type="spellEnd"/>
+      <w:r>
+        <w:t>(</w:t>
+      </w:r>
+      <w:proofErr w:type="spellStart"/>
+      <w:r>
+        <w:t>registrar_intento</w:t>
+      </w:r>
+      <w:proofErr w:type="spellEnd"/>
+      <w:r>
+        <w:t>("</w:t>
+      </w:r>
+      <w:proofErr w:type="spellStart"/>
+      <w:r>
+        <w:t>ana</w:t>
+      </w:r>
+      <w:proofErr w:type="spellEnd"/>
+      <w:r>
+        <w:t>"</w:t>
+      </w:r>
+      <w:proofErr w:type="gramStart"/>
+      <w:r>
+        <w:t xml:space="preserve">))   </w:t>
+      </w:r>
+      <w:proofErr w:type="gramEnd"/>
+      <w:r>
+        <w:t xml:space="preserve"> # ['</w:t>
+      </w:r>
+      <w:proofErr w:type="spellStart"/>
+      <w:r>
+        <w:t>ana</w:t>
+      </w:r>
+      <w:proofErr w:type="spellEnd"/>
+      <w:r>
+        <w:t>']</w:t>
+      </w:r>
+    </w:p>
+    <w:p>
+      <w:proofErr w:type="spellStart"/>
+      <w:r>
+        <w:t>print</w:t>
+      </w:r>
+      <w:proofErr w:type="spellEnd"/>
+      <w:r>
+        <w:t>(</w:t>
+      </w:r>
+      <w:proofErr w:type="spellStart"/>
+      <w:r>
+        <w:t>registrar_intento</w:t>
+      </w:r>
+      <w:proofErr w:type="spellEnd"/>
+      <w:r>
+        <w:t>("</w:t>
+      </w:r>
+      <w:proofErr w:type="spellStart"/>
+      <w:r>
+        <w:t>luis</w:t>
+      </w:r>
+      <w:proofErr w:type="spellEnd"/>
+      <w:r>
+        <w:t>"</w:t>
+      </w:r>
+      <w:proofErr w:type="gramStart"/>
+      <w:r>
+        <w:t xml:space="preserve">))   </w:t>
+      </w:r>
+      <w:proofErr w:type="gramEnd"/>
+      <w:r>
+        <w:t># ['</w:t>
+      </w:r>
+      <w:proofErr w:type="spellStart"/>
+      <w:r>
+        <w:t>ana</w:t>
+      </w:r>
+      <w:proofErr w:type="spellEnd"/>
+      <w:r>
+        <w:t>', '</w:t>
+      </w:r>
+      <w:proofErr w:type="spellStart"/>
+      <w:r>
+        <w:t>luis</w:t>
+      </w:r>
+      <w:proofErr w:type="spellEnd"/>
+      <w:r>
+        <w:t>']</w:t>
+      </w:r>
+    </w:p>
+    <w:p>
+      <w:r>
+        <w:t xml:space="preserve">La segunda llamada </w:t>
+      </w:r>
+      <w:r>
+        <w:rPr>
+          <w:b/>
+          <w:bCs/>
+        </w:rPr>
+        <w:t>no</w:t>
+      </w:r>
+      <w:r>
+        <w:t xml:space="preserve"> imprime ['</w:t>
+      </w:r>
+      <w:proofErr w:type="spellStart"/>
+      <w:r>
+        <w:t>luis</w:t>
+      </w:r>
+      <w:proofErr w:type="spellEnd"/>
+      <w:r>
+        <w:t>'] como probablemente esperaba el autor (asumiendo que cada llamada empieza con una lista vacía), sino ['</w:t>
+      </w:r>
+      <w:proofErr w:type="spellStart"/>
+      <w:r>
+        <w:t>ana</w:t>
+      </w:r>
+      <w:proofErr w:type="spellEnd"/>
+      <w:r>
+        <w:t>', '</w:t>
+      </w:r>
+      <w:proofErr w:type="spellStart"/>
+      <w:r>
+        <w:t>luis</w:t>
+      </w:r>
+      <w:proofErr w:type="spellEnd"/>
+      <w:r>
+        <w:t>'], porque arrastra el estado de la llamada anterior.</w:t>
+      </w:r>
+    </w:p>
+    <w:p>
+      <w:pPr>
+        <w:rPr>
+          <w:b/>
+          <w:bCs/>
+        </w:rPr>
+      </w:pPr>
+      <w:r>
+        <w:rPr>
+          <w:b/>
+          <w:bCs/>
+        </w:rPr>
+        <w:t>Por qué ocurre (mutabilidad e identidad de objetos)</w:t>
+      </w:r>
+    </w:p>
+    <w:p>
+      <w:r>
+        <w:t xml:space="preserve">En Python, los valores por defecto de los parámetros </w:t>
+      </w:r>
+      <w:r>
+        <w:rPr>
+          <w:b/>
+          <w:bCs/>
+        </w:rPr>
+        <w:t>se evalúan una sola vez</w:t>
+      </w:r>
+      <w:r>
+        <w:t>, en el momento en que se define la función (</w:t>
+      </w:r>
+      <w:proofErr w:type="spellStart"/>
+      <w:r>
+        <w:t>def</w:t>
+      </w:r>
+      <w:proofErr w:type="spellEnd"/>
+      <w:r>
+        <w:t>), no cada vez que la función se invoca.</w:t>
+      </w:r>
+    </w:p>
+    <w:p>
+      <w:r>
+        <w:t>Esto significa que historial</w:t>
+      </w:r>
+      <w:proofErr w:type="gramStart"/>
+      <w:r>
+        <w:t>=[</w:t>
+      </w:r>
+      <w:proofErr w:type="gramEnd"/>
+      <w:r>
+        <w:t xml:space="preserve">] crea </w:t>
+      </w:r>
+      <w:r>
+        <w:rPr>
+          <w:b/>
+          <w:bCs/>
+        </w:rPr>
+        <w:t>un único objeto lista</w:t>
+      </w:r>
+      <w:r>
+        <w:t xml:space="preserve"> en memoria, asociado permanentemente a la función </w:t>
+      </w:r>
+      <w:proofErr w:type="spellStart"/>
+      <w:r>
+        <w:t>registrar_intento</w:t>
+      </w:r>
+      <w:proofErr w:type="spellEnd"/>
+      <w:r>
+        <w:t xml:space="preserve">. Cada vez que se llama a la función sin pasar el argumento historial, se reutiliza </w:t>
+      </w:r>
+      <w:r>
+        <w:rPr>
+          <w:b/>
+          <w:bCs/>
+        </w:rPr>
+        <w:t>ese mismo objeto</w:t>
+      </w:r>
+      <w:r>
+        <w:t xml:space="preserve"> (misma identidad, mismo </w:t>
+      </w:r>
+      <w:proofErr w:type="gramStart"/>
+      <w:r>
+        <w:t>id(</w:t>
+      </w:r>
+      <w:proofErr w:type="gramEnd"/>
+      <w:r>
+        <w:t>)), no una lista nueva.</w:t>
+      </w:r>
+    </w:p>
+    <w:p>
+      <w:r>
+        <w:t xml:space="preserve">Como las listas son </w:t>
+      </w:r>
+      <w:r>
+        <w:rPr>
+          <w:b/>
+          <w:bCs/>
+        </w:rPr>
+        <w:t>mutables</w:t>
+      </w:r>
+      <w:r>
+        <w:t xml:space="preserve">, el </w:t>
+      </w:r>
+      <w:proofErr w:type="gramStart"/>
+      <w:r>
+        <w:t>método .</w:t>
+      </w:r>
+      <w:proofErr w:type="spellStart"/>
+      <w:r>
+        <w:t>append</w:t>
+      </w:r>
+      <w:proofErr w:type="spellEnd"/>
+      <w:proofErr w:type="gramEnd"/>
+      <w:r>
+        <w:t>() modifica el objeto en su lugar (</w:t>
+      </w:r>
+      <w:proofErr w:type="spellStart"/>
+      <w:r>
+        <w:t>in-place</w:t>
+      </w:r>
+      <w:proofErr w:type="spellEnd"/>
+      <w:r>
+        <w:t>) en lugar de crear uno nuevo. Por lo tanto:</w:t>
+      </w:r>
+    </w:p>
+    <w:p>
+      <w:pPr>
+        <w:numPr>
+          <w:ilvl w:val="0"/>
+          <w:numId w:val="5"/>
+        </w:numPr>
+      </w:pPr>
+      <w:proofErr w:type="spellStart"/>
+      <w:r>
+        <w:t>registrar_intento</w:t>
+      </w:r>
+      <w:proofErr w:type="spellEnd"/>
+      <w:r>
+        <w:t>("</w:t>
+      </w:r>
+      <w:proofErr w:type="spellStart"/>
+      <w:r>
+        <w:t>ana</w:t>
+      </w:r>
+      <w:proofErr w:type="spellEnd"/>
+      <w:r>
+        <w:t>") → usa la lista por defecto (vacía), le agrega "</w:t>
+      </w:r>
+      <w:proofErr w:type="spellStart"/>
+      <w:r>
+        <w:t>ana</w:t>
+      </w:r>
+      <w:proofErr w:type="spellEnd"/>
+      <w:r>
+        <w:t>" → ['</w:t>
+      </w:r>
+      <w:proofErr w:type="spellStart"/>
+      <w:r>
+        <w:t>ana</w:t>
+      </w:r>
+      <w:proofErr w:type="spellEnd"/>
+      <w:r>
+        <w:t>']. Esa lista queda modificada y sigue existiendo.</w:t>
+      </w:r>
+    </w:p>
+    <w:p>
+      <w:pPr>
+        <w:numPr>
+          <w:ilvl w:val="0"/>
+          <w:numId w:val="5"/>
+        </w:numPr>
+      </w:pPr>
+      <w:proofErr w:type="spellStart"/>
+      <w:r>
+        <w:t>registrar_intento</w:t>
+      </w:r>
+      <w:proofErr w:type="spellEnd"/>
+      <w:r>
+        <w:t>("</w:t>
+      </w:r>
+      <w:proofErr w:type="spellStart"/>
+      <w:r>
+        <w:t>luis</w:t>
+      </w:r>
+      <w:proofErr w:type="spellEnd"/>
+      <w:r>
+        <w:t xml:space="preserve">") → como no se pasó historial, Python reutiliza </w:t>
+      </w:r>
+      <w:r>
+        <w:rPr>
+          <w:b/>
+          <w:bCs/>
+        </w:rPr>
+        <w:t>la misma lista</w:t>
+      </w:r>
+      <w:r>
+        <w:t xml:space="preserve"> (ya contiene "</w:t>
+      </w:r>
+      <w:proofErr w:type="spellStart"/>
+      <w:r>
+        <w:t>ana</w:t>
+      </w:r>
+      <w:proofErr w:type="spellEnd"/>
+      <w:r>
+        <w:t>"), le agrega "</w:t>
+      </w:r>
+      <w:proofErr w:type="spellStart"/>
+      <w:r>
+        <w:t>luis</w:t>
+      </w:r>
+      <w:proofErr w:type="spellEnd"/>
+      <w:r>
+        <w:t>" → ['</w:t>
+      </w:r>
+      <w:proofErr w:type="spellStart"/>
+      <w:r>
+        <w:t>ana</w:t>
+      </w:r>
+      <w:proofErr w:type="spellEnd"/>
+      <w:r>
+        <w:t>', '</w:t>
+      </w:r>
+      <w:proofErr w:type="spellStart"/>
+      <w:r>
+        <w:t>luis</w:t>
+      </w:r>
+      <w:proofErr w:type="spellEnd"/>
+      <w:r>
+        <w:t>'].</w:t>
+      </w:r>
+    </w:p>
+    <w:p>
+      <w:r>
+        <w:t>Se puede comprobar con:</w:t>
+      </w:r>
+    </w:p>
+    <w:p>
+      <w:proofErr w:type="spellStart"/>
+      <w:r>
+        <w:t>print</w:t>
+      </w:r>
+      <w:proofErr w:type="spellEnd"/>
+      <w:r>
+        <w:t>(</w:t>
+      </w:r>
+      <w:proofErr w:type="spellStart"/>
+      <w:r>
+        <w:t>registrar_</w:t>
+      </w:r>
+      <w:proofErr w:type="gramStart"/>
+      <w:r>
+        <w:t>intento._</w:t>
+      </w:r>
+      <w:proofErr w:type="gramEnd"/>
+      <w:r>
+        <w:t>_defaults</w:t>
+      </w:r>
+      <w:proofErr w:type="spellEnd"/>
+      <w:r>
+        <w:t>_</w:t>
+      </w:r>
+      <w:proofErr w:type="gramStart"/>
+      <w:r>
+        <w:t>_)  #</w:t>
+      </w:r>
+      <w:proofErr w:type="gramEnd"/>
+      <w:r>
+        <w:t xml:space="preserve"> (['</w:t>
+      </w:r>
+      <w:proofErr w:type="spellStart"/>
+      <w:r>
+        <w:t>ana</w:t>
+      </w:r>
+      <w:proofErr w:type="spellEnd"/>
+      <w:r>
+        <w:t>', '</w:t>
+      </w:r>
+      <w:proofErr w:type="spellStart"/>
+      <w:r>
+        <w:t>luis</w:t>
+      </w:r>
+      <w:proofErr w:type="spellEnd"/>
+      <w:r>
+        <w:t>'],) — el objeto por defecto fue mutado</w:t>
+      </w:r>
+    </w:p>
+    <w:p>
+      <w:r>
+        <w:t xml:space="preserve">Este es el clásico error del </w:t>
+      </w:r>
+      <w:r>
+        <w:rPr>
+          <w:b/>
+          <w:bCs/>
+        </w:rPr>
+        <w:t xml:space="preserve">"mutable default </w:t>
+      </w:r>
+      <w:proofErr w:type="spellStart"/>
+      <w:r>
+        <w:rPr>
+          <w:b/>
+          <w:bCs/>
+        </w:rPr>
+        <w:t>argument</w:t>
+      </w:r>
+      <w:proofErr w:type="spellEnd"/>
+      <w:r>
+        <w:rPr>
+          <w:b/>
+          <w:bCs/>
+        </w:rPr>
+        <w:t>"</w:t>
+      </w:r>
+      <w:r>
+        <w:t>: el valor por defecto actúa como una especie de variable estática compartida entre todas las llamadas que no proveen ese argumento explícitamente, algo que contradice la intuición de que cada llamada debería tener su propio estado inicial "limpio".</w:t>
+      </w:r>
+    </w:p>
+    <w:p>
+      <w:pPr>
+        <w:rPr>
+          <w:b/>
+          <w:bCs/>
+        </w:rPr>
+      </w:pPr>
+      <w:r>
+        <w:rPr>
+          <w:b/>
+          <w:bCs/>
+        </w:rPr>
+        <w:t>Corrección estándar</w:t>
+      </w:r>
+    </w:p>
+    <w:p>
+      <w:r>
+        <w:t xml:space="preserve">Usar </w:t>
+      </w:r>
+      <w:proofErr w:type="spellStart"/>
+      <w:r>
+        <w:t>None</w:t>
+      </w:r>
+      <w:proofErr w:type="spellEnd"/>
+      <w:r>
+        <w:t xml:space="preserve"> como centinela y crear la lista nueva dentro del cuerpo de la función:</w:t>
+      </w:r>
+    </w:p>
+    <w:p>
+      <w:pPr>
+        <w:rPr>
+          <w:lang w:val="en-US"/>
+        </w:rPr>
+      </w:pPr>
+      <w:r>
+        <w:rPr>
+          <w:lang w:val="en-US"/>
+        </w:rPr>
+        <w:t xml:space="preserve">def </w:t>
+      </w:r>
+      <w:proofErr w:type="spellStart"/>
+      <w:r>
+        <w:rPr>
+          <w:lang w:val="en-US"/>
+        </w:rPr>
+        <w:t>registrar_</w:t>
+      </w:r>
+      <w:proofErr w:type="gramStart"/>
+      <w:r>
+        <w:rPr>
+          <w:lang w:val="en-US"/>
+        </w:rPr>
+        <w:t>intento</w:t>
+      </w:r>
+      <w:proofErr w:type="spellEnd"/>
+      <w:r>
+        <w:rPr>
+          <w:lang w:val="en-US"/>
+        </w:rPr>
+        <w:t>(</w:t>
+      </w:r>
+      <w:proofErr w:type="spellStart"/>
+      <w:proofErr w:type="gramEnd"/>
+      <w:r>
+        <w:rPr>
+          <w:lang w:val="en-US"/>
+        </w:rPr>
+        <w:t>usuario</w:t>
+      </w:r>
+      <w:proofErr w:type="spellEnd"/>
+      <w:r>
+        <w:rPr>
+          <w:lang w:val="en-US"/>
+        </w:rPr>
+        <w:t xml:space="preserve">, </w:t>
+      </w:r>
+      <w:proofErr w:type="spellStart"/>
+      <w:r>
+        <w:rPr>
+          <w:lang w:val="en-US"/>
+        </w:rPr>
+        <w:t>historial</w:t>
+      </w:r>
+      <w:proofErr w:type="spellEnd"/>
+      <w:r>
+        <w:rPr>
+          <w:lang w:val="en-US"/>
+        </w:rPr>
+        <w:t>=None):</w:t>
+      </w:r>
+    </w:p>
+    <w:p>
+      <w:pPr>
+        <w:rPr>
+          <w:lang w:val="en-US"/>
+        </w:rPr>
+      </w:pPr>
+      <w:r>
+        <w:rPr>
+          <w:lang w:val="en-US"/>
+        </w:rPr>
+        <w:lastRenderedPageBreak/>
+        <w:t xml:space="preserve">    if </w:t>
+      </w:r>
+      <w:proofErr w:type="spellStart"/>
+      <w:r>
+        <w:rPr>
+          <w:lang w:val="en-US"/>
+        </w:rPr>
+        <w:t>historial</w:t>
+      </w:r>
+      <w:proofErr w:type="spellEnd"/>
+      <w:r>
+        <w:rPr>
+          <w:lang w:val="en-US"/>
+        </w:rPr>
+        <w:t xml:space="preserve"> is None:</w:t>
+      </w:r>
+    </w:p>
+    <w:p>
+      <w:pPr>
+        <w:rPr>
+          <w:lang w:val="en-US"/>
+        </w:rPr>
+      </w:pPr>
+      <w:r>
+        <w:rPr>
+          <w:lang w:val="en-US"/>
+        </w:rPr>
+        <w:t xml:space="preserve">        </w:t>
+      </w:r>
+      <w:proofErr w:type="spellStart"/>
+      <w:r>
+        <w:rPr>
+          <w:lang w:val="en-US"/>
+        </w:rPr>
+        <w:t>historial</w:t>
+      </w:r>
+      <w:proofErr w:type="spellEnd"/>
+      <w:r>
+        <w:rPr>
+          <w:lang w:val="en-US"/>
+        </w:rPr>
+        <w:t xml:space="preserve"> = []</w:t>
+      </w:r>
+    </w:p>
+    <w:p>
+      <w:pPr>
+        <w:rPr>
+          <w:lang w:val="en-US"/>
+        </w:rPr>
+      </w:pPr>
+      <w:r>
+        <w:rPr>
+          <w:lang w:val="en-US"/>
+        </w:rPr>
+        <w:t xml:space="preserve">    </w:t>
+      </w:r>
+      <w:proofErr w:type="spellStart"/>
+      <w:proofErr w:type="gramStart"/>
+      <w:r>
+        <w:rPr>
+          <w:lang w:val="en-US"/>
+        </w:rPr>
+        <w:t>historial.append</w:t>
+      </w:r>
+      <w:proofErr w:type="spellEnd"/>
+      <w:proofErr w:type="gramEnd"/>
+      <w:r>
+        <w:rPr>
+          <w:lang w:val="en-US"/>
+        </w:rPr>
+        <w:t>(</w:t>
+      </w:r>
+      <w:proofErr w:type="spellStart"/>
+      <w:r>
+        <w:rPr>
+          <w:lang w:val="en-US"/>
+        </w:rPr>
+        <w:t>usuario</w:t>
+      </w:r>
+      <w:proofErr w:type="spellEnd"/>
+      <w:r>
+        <w:rPr>
+          <w:lang w:val="en-US"/>
+        </w:rPr>
+        <w:t>)</w:t>
+      </w:r>
+    </w:p>
+    <w:p>
+      <w:pPr>
+        <w:rPr>
+          <w:lang w:val="en-US"/>
+        </w:rPr>
+      </w:pPr>
+      <w:r>
+        <w:rPr>
+          <w:lang w:val="en-US"/>
+        </w:rPr>
+        <w:t xml:space="preserve">    </w:t>
+      </w:r>
+      <w:proofErr w:type="gramStart"/>
+      <w:r>
+        <w:rPr>
+          <w:lang w:val="en-US"/>
+        </w:rPr>
+        <w:t>return</w:t>
+      </w:r>
+      <w:proofErr w:type="gramEnd"/>
+      <w:r>
+        <w:rPr>
+          <w:lang w:val="en-US"/>
+        </w:rPr>
+        <w:t xml:space="preserve"> </w:t>
+      </w:r>
+      <w:proofErr w:type="spellStart"/>
+      <w:r>
+        <w:rPr>
+          <w:lang w:val="en-US"/>
+        </w:rPr>
+        <w:t>historial</w:t>
+      </w:r>
+      <w:proofErr w:type="spellEnd"/>
+    </w:p>
+    <w:p>
+      <w:r>
+        <w:t xml:space="preserve">De esta forma, </w:t>
+      </w:r>
+      <w:proofErr w:type="spellStart"/>
+      <w:r>
+        <w:t>None</w:t>
+      </w:r>
+      <w:proofErr w:type="spellEnd"/>
+      <w:r>
+        <w:t xml:space="preserve"> (inmutable) es el único valor por defecto compartido, y en cada llamada sin historial explícito se crea una lista </w:t>
+      </w:r>
+      <w:r>
+        <w:rPr>
+          <w:b/>
+          <w:bCs/>
+        </w:rPr>
+        <w:t>nueva e independiente</w:t>
+      </w:r>
+      <w:r>
+        <w:t>, evitando el acoplamiento accidental de estado entre invocaciones.</w:t>
+      </w:r>
+    </w:p>
+    <w:p>
+      <w:proofErr w:type="spellStart"/>
+      <w:r>
+        <w:t>print</w:t>
+      </w:r>
+      <w:proofErr w:type="spellEnd"/>
+      <w:r>
+        <w:t>(</w:t>
+      </w:r>
+      <w:proofErr w:type="spellStart"/>
+      <w:r>
+        <w:t>registrar_intento</w:t>
+      </w:r>
+      <w:proofErr w:type="spellEnd"/>
+      <w:r>
+        <w:t>("</w:t>
+      </w:r>
+      <w:proofErr w:type="spellStart"/>
+      <w:r>
+        <w:t>ana</w:t>
+      </w:r>
+      <w:proofErr w:type="spellEnd"/>
+      <w:r>
+        <w:t>"</w:t>
+      </w:r>
+      <w:proofErr w:type="gramStart"/>
+      <w:r>
+        <w:t xml:space="preserve">))   </w:t>
+      </w:r>
+      <w:proofErr w:type="gramEnd"/>
+      <w:r>
+        <w:t xml:space="preserve"> # ['</w:t>
+      </w:r>
+      <w:proofErr w:type="spellStart"/>
+      <w:r>
+        <w:t>ana</w:t>
+      </w:r>
+      <w:proofErr w:type="spellEnd"/>
+      <w:r>
+        <w:t>']</w:t>
+      </w:r>
+    </w:p>
+    <w:p>
+      <w:proofErr w:type="spellStart"/>
+      <w:r>
+        <w:t>print</w:t>
+      </w:r>
+      <w:proofErr w:type="spellEnd"/>
+      <w:r>
+        <w:t>(</w:t>
+      </w:r>
+      <w:proofErr w:type="spellStart"/>
+      <w:r>
+        <w:t>registrar_intento</w:t>
+      </w:r>
+      <w:proofErr w:type="spellEnd"/>
+      <w:r>
+        <w:t>("</w:t>
+      </w:r>
+      <w:proofErr w:type="spellStart"/>
+      <w:r>
+        <w:t>luis</w:t>
+      </w:r>
+      <w:proofErr w:type="spellEnd"/>
+      <w:r>
+        <w:t>"</w:t>
+      </w:r>
+      <w:proofErr w:type="gramStart"/>
+      <w:r>
+        <w:t xml:space="preserve">))   </w:t>
+      </w:r>
+      <w:proofErr w:type="gramEnd"/>
+      <w:r>
+        <w:t># ['</w:t>
+      </w:r>
+      <w:proofErr w:type="spellStart"/>
+      <w:r>
+        <w:t>luis</w:t>
+      </w:r>
+      <w:proofErr w:type="spellEnd"/>
+      <w:r>
+        <w:t>'</w:t>
+      </w:r>
+      <w:proofErr w:type="gramStart"/>
+      <w:r>
+        <w:t xml:space="preserve">]  </w:t>
+      </w:r>
+      <w:r>
+        <w:rPr>
+          <w:rFonts w:ascii="Segoe UI Emoji" w:hAnsi="Segoe UI Emoji" w:cs="Segoe UI Emoji"/>
+        </w:rPr>
+        <w:t>✔</w:t>
+      </w:r>
+      <w:proofErr w:type="gramEnd"/>
+      <w:r>
+        <w:rPr>
+          <w:rFonts w:ascii="Segoe UI Emoji" w:hAnsi="Segoe UI Emoji" w:cs="Segoe UI Emoji"/>
+        </w:rPr>
+        <w:t>️</w:t>
+      </w:r>
+      <w:r>
+        <w:t xml:space="preserve"> comportamiento esperado</w:t>
+      </w:r>
+    </w:p>
+    <w:p>
       <w:r>
         <w:br w:type="page"/>
       </w:r>
@@ -1971,7 +3946,15 @@
       </w:pPr>
       <w:r>
         <w:lastRenderedPageBreak/>
-        <w:t>Bloque C — Situaciones-problema integradoras  (66 puntos)</w:t>
+        <w:t xml:space="preserve">Bloque C — Situaciones-problema </w:t>
+      </w:r>
+      <w:proofErr w:type="gramStart"/>
+      <w:r>
+        <w:t>integradoras  (</w:t>
+      </w:r>
+      <w:proofErr w:type="gramEnd"/>
+      <w:r>
+        <w:t>66 puntos)</w:t>
       </w:r>
     </w:p>
     <w:p>
@@ -1980,7 +3963,15 @@
         <w:spacing w:before="250" w:after="120"/>
       </w:pPr>
       <w:r>
-        <w:t>C1. El sensor que a veces no responde  (14 puntos)</w:t>
+        <w:t xml:space="preserve">C1. El sensor que a veces no </w:t>
+      </w:r>
+      <w:proofErr w:type="gramStart"/>
+      <w:r>
+        <w:t>responde  (</w:t>
+      </w:r>
+      <w:proofErr w:type="gramEnd"/>
+      <w:r>
+        <w:t>14 puntos)</w:t>
       </w:r>
     </w:p>
     <w:p>
@@ -1993,7 +3984,43 @@
           <w:sz w:val="22"/>
           <w:szCs w:val="22"/>
         </w:rPr>
-        <w:t>Un sensor IoT de temperatura envía una lectura cada hora, pero en ocasiones falla y envía None en vez de un número:</w:t>
+        <w:t xml:space="preserve">Un sensor </w:t>
+      </w:r>
+      <w:proofErr w:type="spellStart"/>
+      <w:r>
+        <w:rPr>
+          <w:rFonts w:ascii="Calibri" w:eastAsia="Calibri" w:hAnsi="Calibri" w:cs="Calibri"/>
+          <w:sz w:val="22"/>
+          <w:szCs w:val="22"/>
+        </w:rPr>
+        <w:t>IoT</w:t>
+      </w:r>
+      <w:proofErr w:type="spellEnd"/>
+      <w:r>
+        <w:rPr>
+          <w:rFonts w:ascii="Calibri" w:eastAsia="Calibri" w:hAnsi="Calibri" w:cs="Calibri"/>
+          <w:sz w:val="22"/>
+          <w:szCs w:val="22"/>
+        </w:rPr>
+        <w:t xml:space="preserve"> de temperatura envía una lectura cada hora, pero en ocasiones falla y envía </w:t>
+      </w:r>
+      <w:proofErr w:type="spellStart"/>
+      <w:r>
+        <w:rPr>
+          <w:rFonts w:ascii="Calibri" w:eastAsia="Calibri" w:hAnsi="Calibri" w:cs="Calibri"/>
+          <w:sz w:val="22"/>
+          <w:szCs w:val="22"/>
+        </w:rPr>
+        <w:t>None</w:t>
+      </w:r>
+      <w:proofErr w:type="spellEnd"/>
+      <w:r>
+        <w:rPr>
+          <w:rFonts w:ascii="Calibri" w:eastAsia="Calibri" w:hAnsi="Calibri" w:cs="Calibri"/>
+          <w:sz w:val="22"/>
+          <w:szCs w:val="22"/>
+        </w:rPr>
+        <w:t xml:space="preserve"> en vez de un número:</w:t>
       </w:r>
     </w:p>
     <w:p>
@@ -2006,7 +4033,49 @@
         <w:rPr>
           <w:rFonts w:ascii="Consolas" w:eastAsia="Consolas" w:hAnsi="Consolas" w:cs="Consolas"/>
         </w:rPr>
-        <w:t>lecturas = [21.5, 22.0, None, 23.4, 24.1, None, 20.8, 19.9, None, 25.0]</w:t>
+        <w:t xml:space="preserve">lecturas = [21.5, 22.0, </w:t>
+      </w:r>
+      <w:proofErr w:type="spellStart"/>
+      <w:r>
+        <w:rPr>
+          <w:rFonts w:ascii="Consolas" w:eastAsia="Consolas" w:hAnsi="Consolas" w:cs="Consolas"/>
+        </w:rPr>
+        <w:t>None</w:t>
+      </w:r>
+      <w:proofErr w:type="spellEnd"/>
+      <w:r>
+        <w:rPr>
+          <w:rFonts w:ascii="Consolas" w:eastAsia="Consolas" w:hAnsi="Consolas" w:cs="Consolas"/>
+        </w:rPr>
+        <w:t xml:space="preserve">, 23.4, 24.1, </w:t>
+      </w:r>
+      <w:proofErr w:type="spellStart"/>
+      <w:r>
+        <w:rPr>
+          <w:rFonts w:ascii="Consolas" w:eastAsia="Consolas" w:hAnsi="Consolas" w:cs="Consolas"/>
+        </w:rPr>
+        <w:t>None</w:t>
+      </w:r>
+      <w:proofErr w:type="spellEnd"/>
+      <w:r>
+        <w:rPr>
+          <w:rFonts w:ascii="Consolas" w:eastAsia="Consolas" w:hAnsi="Consolas" w:cs="Consolas"/>
+        </w:rPr>
+        <w:t xml:space="preserve">, 20.8, 19.9, </w:t>
+      </w:r>
+      <w:proofErr w:type="spellStart"/>
+      <w:r>
+        <w:rPr>
+          <w:rFonts w:ascii="Consolas" w:eastAsia="Consolas" w:hAnsi="Consolas" w:cs="Consolas"/>
+        </w:rPr>
+        <w:t>None</w:t>
+      </w:r>
+      <w:proofErr w:type="spellEnd"/>
+      <w:r>
+        <w:rPr>
+          <w:rFonts w:ascii="Consolas" w:eastAsia="Consolas" w:hAnsi="Consolas" w:cs="Consolas"/>
+        </w:rPr>
+        <w:t>, 25.0]</w:t>
       </w:r>
     </w:p>
     <w:p>
@@ -2024,7 +4093,61 @@
           <w:sz w:val="22"/>
           <w:szCs w:val="22"/>
         </w:rPr>
-        <w:t>a) (3 pts) Indique el tipo de dato de lecturas[2] y explique por qué None no es lo mismo que 0 en este contexto.</w:t>
+        <w:t xml:space="preserve">a) (3 </w:t>
+      </w:r>
+      <w:proofErr w:type="spellStart"/>
+      <w:r>
+        <w:rPr>
+          <w:rFonts w:ascii="Calibri" w:eastAsia="Calibri" w:hAnsi="Calibri" w:cs="Calibri"/>
+          <w:sz w:val="22"/>
+          <w:szCs w:val="22"/>
+        </w:rPr>
+        <w:t>pts</w:t>
+      </w:r>
+      <w:proofErr w:type="spellEnd"/>
+      <w:r>
+        <w:rPr>
+          <w:rFonts w:ascii="Calibri" w:eastAsia="Calibri" w:hAnsi="Calibri" w:cs="Calibri"/>
+          <w:sz w:val="22"/>
+          <w:szCs w:val="22"/>
+        </w:rPr>
+        <w:t xml:space="preserve">) Indique el tipo de dato de </w:t>
+      </w:r>
+      <w:proofErr w:type="gramStart"/>
+      <w:r>
+        <w:rPr>
+          <w:rFonts w:ascii="Calibri" w:eastAsia="Calibri" w:hAnsi="Calibri" w:cs="Calibri"/>
+          <w:sz w:val="22"/>
+          <w:szCs w:val="22"/>
+        </w:rPr>
+        <w:t>lecturas[</w:t>
+      </w:r>
+      <w:proofErr w:type="gramEnd"/>
+      <w:r>
+        <w:rPr>
+          <w:rFonts w:ascii="Calibri" w:eastAsia="Calibri" w:hAnsi="Calibri" w:cs="Calibri"/>
+          <w:sz w:val="22"/>
+          <w:szCs w:val="22"/>
+        </w:rPr>
+        <w:t xml:space="preserve">2] y explique por qué </w:t>
+      </w:r>
+      <w:proofErr w:type="spellStart"/>
+      <w:r>
+        <w:rPr>
+          <w:rFonts w:ascii="Calibri" w:eastAsia="Calibri" w:hAnsi="Calibri" w:cs="Calibri"/>
+          <w:sz w:val="22"/>
+          <w:szCs w:val="22"/>
+        </w:rPr>
+        <w:t>None</w:t>
+      </w:r>
+      <w:proofErr w:type="spellEnd"/>
+      <w:r>
+        <w:rPr>
+          <w:rFonts w:ascii="Calibri" w:eastAsia="Calibri" w:hAnsi="Calibri" w:cs="Calibri"/>
+          <w:sz w:val="22"/>
+          <w:szCs w:val="22"/>
+        </w:rPr>
+        <w:t xml:space="preserve"> no es lo mismo que 0 en este contexto.</w:t>
       </w:r>
     </w:p>
     <w:p>
@@ -2042,7 +4165,79 @@
           <w:sz w:val="22"/>
           <w:szCs w:val="22"/>
         </w:rPr>
-        <w:t>b) (4 pts) Escriba una lista por comprensión que filtre las lecturas válidas usando el operador de identidad is (no ==) para descartar None. Justifique por qué aquí se prefiere is a ==.</w:t>
+        <w:t xml:space="preserve">b) (4 </w:t>
+      </w:r>
+      <w:proofErr w:type="spellStart"/>
+      <w:r>
+        <w:rPr>
+          <w:rFonts w:ascii="Calibri" w:eastAsia="Calibri" w:hAnsi="Calibri" w:cs="Calibri"/>
+          <w:sz w:val="22"/>
+          <w:szCs w:val="22"/>
+        </w:rPr>
+        <w:t>pts</w:t>
+      </w:r>
+      <w:proofErr w:type="spellEnd"/>
+      <w:r>
+        <w:rPr>
+          <w:rFonts w:ascii="Calibri" w:eastAsia="Calibri" w:hAnsi="Calibri" w:cs="Calibri"/>
+          <w:sz w:val="22"/>
+          <w:szCs w:val="22"/>
+        </w:rPr>
+        <w:t xml:space="preserve">) Escriba una lista por comprensión que filtre las lecturas válidas usando el operador de identidad </w:t>
+      </w:r>
+      <w:proofErr w:type="spellStart"/>
+      <w:r>
+        <w:rPr>
+          <w:rFonts w:ascii="Calibri" w:eastAsia="Calibri" w:hAnsi="Calibri" w:cs="Calibri"/>
+          <w:sz w:val="22"/>
+          <w:szCs w:val="22"/>
+        </w:rPr>
+        <w:t>is</w:t>
+      </w:r>
+      <w:proofErr w:type="spellEnd"/>
+      <w:r>
+        <w:rPr>
+          <w:rFonts w:ascii="Calibri" w:eastAsia="Calibri" w:hAnsi="Calibri" w:cs="Calibri"/>
+          <w:sz w:val="22"/>
+          <w:szCs w:val="22"/>
+        </w:rPr>
+        <w:t xml:space="preserve"> (no ==) para descartar </w:t>
+      </w:r>
+      <w:proofErr w:type="spellStart"/>
+      <w:r>
+        <w:rPr>
+          <w:rFonts w:ascii="Calibri" w:eastAsia="Calibri" w:hAnsi="Calibri" w:cs="Calibri"/>
+          <w:sz w:val="22"/>
+          <w:szCs w:val="22"/>
+        </w:rPr>
+        <w:t>None</w:t>
+      </w:r>
+      <w:proofErr w:type="spellEnd"/>
+      <w:r>
+        <w:rPr>
+          <w:rFonts w:ascii="Calibri" w:eastAsia="Calibri" w:hAnsi="Calibri" w:cs="Calibri"/>
+          <w:sz w:val="22"/>
+          <w:szCs w:val="22"/>
+        </w:rPr>
+        <w:t xml:space="preserve">. Justifique por qué aquí se prefiere </w:t>
+      </w:r>
+      <w:proofErr w:type="spellStart"/>
+      <w:r>
+        <w:rPr>
+          <w:rFonts w:ascii="Calibri" w:eastAsia="Calibri" w:hAnsi="Calibri" w:cs="Calibri"/>
+          <w:sz w:val="22"/>
+          <w:szCs w:val="22"/>
+        </w:rPr>
+        <w:t>is</w:t>
+      </w:r>
+      <w:proofErr w:type="spellEnd"/>
+      <w:r>
+        <w:rPr>
+          <w:rFonts w:ascii="Calibri" w:eastAsia="Calibri" w:hAnsi="Calibri" w:cs="Calibri"/>
+          <w:sz w:val="22"/>
+          <w:szCs w:val="22"/>
+        </w:rPr>
+        <w:t xml:space="preserve"> a ==.</w:t>
       </w:r>
     </w:p>
     <w:p>
@@ -2060,7 +4255,117 @@
           <w:sz w:val="22"/>
           <w:szCs w:val="22"/>
         </w:rPr>
-        <w:t>c) (4 pts) Con la lista filtrada, calcule promedio, máximo y mínimo usando sum(), len(), max() y min().</w:t>
+        <w:t xml:space="preserve">c) (4 </w:t>
+      </w:r>
+      <w:proofErr w:type="spellStart"/>
+      <w:r>
+        <w:rPr>
+          <w:rFonts w:ascii="Calibri" w:eastAsia="Calibri" w:hAnsi="Calibri" w:cs="Calibri"/>
+          <w:sz w:val="22"/>
+          <w:szCs w:val="22"/>
+        </w:rPr>
+        <w:t>pts</w:t>
+      </w:r>
+      <w:proofErr w:type="spellEnd"/>
+      <w:r>
+        <w:rPr>
+          <w:rFonts w:ascii="Calibri" w:eastAsia="Calibri" w:hAnsi="Calibri" w:cs="Calibri"/>
+          <w:sz w:val="22"/>
+          <w:szCs w:val="22"/>
+        </w:rPr>
+        <w:t xml:space="preserve">) Con la lista filtrada, calcule promedio, máximo y mínimo usando </w:t>
+      </w:r>
+      <w:proofErr w:type="gramStart"/>
+      <w:r>
+        <w:rPr>
+          <w:rFonts w:ascii="Calibri" w:eastAsia="Calibri" w:hAnsi="Calibri" w:cs="Calibri"/>
+          <w:sz w:val="22"/>
+          <w:szCs w:val="22"/>
+        </w:rPr>
+        <w:t>sum(</w:t>
+      </w:r>
+      <w:proofErr w:type="gramEnd"/>
+      <w:r>
+        <w:rPr>
+          <w:rFonts w:ascii="Calibri" w:eastAsia="Calibri" w:hAnsi="Calibri" w:cs="Calibri"/>
+          <w:sz w:val="22"/>
+          <w:szCs w:val="22"/>
+        </w:rPr>
+        <w:t xml:space="preserve">), </w:t>
+      </w:r>
+      <w:proofErr w:type="spellStart"/>
+      <w:proofErr w:type="gramStart"/>
+      <w:r>
+        <w:rPr>
+          <w:rFonts w:ascii="Calibri" w:eastAsia="Calibri" w:hAnsi="Calibri" w:cs="Calibri"/>
+          <w:sz w:val="22"/>
+          <w:szCs w:val="22"/>
+        </w:rPr>
+        <w:t>len</w:t>
+      </w:r>
+      <w:proofErr w:type="spellEnd"/>
+      <w:r>
+        <w:rPr>
+          <w:rFonts w:ascii="Calibri" w:eastAsia="Calibri" w:hAnsi="Calibri" w:cs="Calibri"/>
+          <w:sz w:val="22"/>
+          <w:szCs w:val="22"/>
+        </w:rPr>
+        <w:t>(</w:t>
+      </w:r>
+      <w:proofErr w:type="gramEnd"/>
+      <w:r>
+        <w:rPr>
+          <w:rFonts w:ascii="Calibri" w:eastAsia="Calibri" w:hAnsi="Calibri" w:cs="Calibri"/>
+          <w:sz w:val="22"/>
+          <w:szCs w:val="22"/>
+        </w:rPr>
+        <w:t xml:space="preserve">), </w:t>
+      </w:r>
+      <w:proofErr w:type="spellStart"/>
+      <w:proofErr w:type="gramStart"/>
+      <w:r>
+        <w:rPr>
+          <w:rFonts w:ascii="Calibri" w:eastAsia="Calibri" w:hAnsi="Calibri" w:cs="Calibri"/>
+          <w:sz w:val="22"/>
+          <w:szCs w:val="22"/>
+        </w:rPr>
+        <w:t>max</w:t>
+      </w:r>
+      <w:proofErr w:type="spellEnd"/>
+      <w:r>
+        <w:rPr>
+          <w:rFonts w:ascii="Calibri" w:eastAsia="Calibri" w:hAnsi="Calibri" w:cs="Calibri"/>
+          <w:sz w:val="22"/>
+          <w:szCs w:val="22"/>
+        </w:rPr>
+        <w:t>(</w:t>
+      </w:r>
+      <w:proofErr w:type="gramEnd"/>
+      <w:r>
+        <w:rPr>
+          <w:rFonts w:ascii="Calibri" w:eastAsia="Calibri" w:hAnsi="Calibri" w:cs="Calibri"/>
+          <w:sz w:val="22"/>
+          <w:szCs w:val="22"/>
+        </w:rPr>
+        <w:t xml:space="preserve">) y </w:t>
+      </w:r>
+      <w:proofErr w:type="gramStart"/>
+      <w:r>
+        <w:rPr>
+          <w:rFonts w:ascii="Calibri" w:eastAsia="Calibri" w:hAnsi="Calibri" w:cs="Calibri"/>
+          <w:sz w:val="22"/>
+          <w:szCs w:val="22"/>
+        </w:rPr>
+        <w:t>min(</w:t>
+      </w:r>
+      <w:proofErr w:type="gramEnd"/>
+      <w:r>
+        <w:rPr>
+          <w:rFonts w:ascii="Calibri" w:eastAsia="Calibri" w:hAnsi="Calibri" w:cs="Calibri"/>
+          <w:sz w:val="22"/>
+          <w:szCs w:val="22"/>
+        </w:rPr>
+        <w:t>).</w:t>
       </w:r>
     </w:p>
     <w:p>
@@ -2078,7 +4383,25 @@
           <w:sz w:val="22"/>
           <w:szCs w:val="22"/>
         </w:rPr>
-        <w:t>d) (3 pts) Convierta la lista filtrada en una tupla. Explique, en términos de mutabilidad, una razón por la que este registro “cerrado” del día se beneficiaría de ser inmutable.</w:t>
+        <w:t xml:space="preserve">d) (3 </w:t>
+      </w:r>
+      <w:proofErr w:type="spellStart"/>
+      <w:r>
+        <w:rPr>
+          <w:rFonts w:ascii="Calibri" w:eastAsia="Calibri" w:hAnsi="Calibri" w:cs="Calibri"/>
+          <w:sz w:val="22"/>
+          <w:szCs w:val="22"/>
+        </w:rPr>
+        <w:t>pts</w:t>
+      </w:r>
+      <w:proofErr w:type="spellEnd"/>
+      <w:r>
+        <w:rPr>
+          <w:rFonts w:ascii="Calibri" w:eastAsia="Calibri" w:hAnsi="Calibri" w:cs="Calibri"/>
+          <w:sz w:val="22"/>
+          <w:szCs w:val="22"/>
+        </w:rPr>
+        <w:t>) Convierta la lista filtrada en una tupla. Explique, en términos de mutabilidad, una razón por la que este registro “cerrado” del día se beneficiaría de ser inmutable.</w:t>
       </w:r>
     </w:p>
     <w:p>
@@ -2087,7 +4410,15 @@
         <w:spacing w:before="250" w:after="120"/>
       </w:pPr>
       <w:r>
-        <w:t>C2. El inventario con precios corruptos  (14 puntos)</w:t>
+        <w:t xml:space="preserve">C2. El inventario con precios </w:t>
+      </w:r>
+      <w:proofErr w:type="gramStart"/>
+      <w:r>
+        <w:t>corruptos  (</w:t>
+      </w:r>
+      <w:proofErr w:type="gramEnd"/>
+      <w:r>
+        <w:t>14 puntos)</w:t>
       </w:r>
     </w:p>
     <w:p>
@@ -2108,12 +4439,29 @@
         <w:shd w:val="clear" w:color="auto" w:fill="F2F2F2"/>
         <w:spacing w:before="60" w:after="120"/>
         <w:ind w:left="360"/>
-      </w:pPr>
-      <w:r>
         <w:rPr>
           <w:rFonts w:ascii="Consolas" w:eastAsia="Consolas" w:hAnsi="Consolas" w:cs="Consolas"/>
         </w:rPr>
-        <w:t>precios = [15000, 8700, 23000, None, 9800, -100, 45000]</w:t>
+      </w:pPr>
+      <w:r>
+        <w:rPr>
+          <w:rFonts w:ascii="Consolas" w:eastAsia="Consolas" w:hAnsi="Consolas" w:cs="Consolas"/>
+        </w:rPr>
+        <w:t xml:space="preserve">precios = [15000, 8700, 23000, </w:t>
+      </w:r>
+      <w:proofErr w:type="spellStart"/>
+      <w:r>
+        <w:rPr>
+          <w:rFonts w:ascii="Consolas" w:eastAsia="Consolas" w:hAnsi="Consolas" w:cs="Consolas"/>
+        </w:rPr>
+        <w:t>None</w:t>
+      </w:r>
+      <w:proofErr w:type="spellEnd"/>
+      <w:r>
+        <w:rPr>
+          <w:rFonts w:ascii="Consolas" w:eastAsia="Consolas" w:hAnsi="Consolas" w:cs="Consolas"/>
+        </w:rPr>
+        <w:t>, 9800, -100, 45000]</w:t>
       </w:r>
     </w:p>
     <w:p>
@@ -2131,7 +4479,51 @@
           <w:sz w:val="22"/>
           <w:szCs w:val="22"/>
         </w:rPr>
-        <w:t>a) (3 pts) ¿Qué operador relacional usaría para descartar los precios negativos? Escriba la condición.</w:t>
+        <w:t>a</w:t>
+      </w:r>
+      <w:r>
+        <w:rPr>
+          <w:rFonts w:ascii="Calibri" w:eastAsia="Calibri" w:hAnsi="Calibri" w:cs="Calibri"/>
+          <w:sz w:val="22"/>
+          <w:szCs w:val="22"/>
+        </w:rPr>
+        <w:t xml:space="preserve">) (4 </w:t>
+      </w:r>
+      <w:proofErr w:type="spellStart"/>
+      <w:r>
+        <w:rPr>
+          <w:rFonts w:ascii="Calibri" w:eastAsia="Calibri" w:hAnsi="Calibri" w:cs="Calibri"/>
+          <w:sz w:val="22"/>
+          <w:szCs w:val="22"/>
+        </w:rPr>
+        <w:t>pts</w:t>
+      </w:r>
+      <w:proofErr w:type="spellEnd"/>
+      <w:r>
+        <w:rPr>
+          <w:rFonts w:ascii="Calibri" w:eastAsia="Calibri" w:hAnsi="Calibri" w:cs="Calibri"/>
+          <w:sz w:val="22"/>
+          <w:szCs w:val="22"/>
+        </w:rPr>
+        <w:t xml:space="preserve">) Escriba una lista por comprensión que combine, con and, la condición de (a) con la verificación de que el precio no sea </w:t>
+      </w:r>
+      <w:proofErr w:type="spellStart"/>
+      <w:r>
+        <w:rPr>
+          <w:rFonts w:ascii="Calibri" w:eastAsia="Calibri" w:hAnsi="Calibri" w:cs="Calibri"/>
+          <w:sz w:val="22"/>
+          <w:szCs w:val="22"/>
+        </w:rPr>
+        <w:t>None</w:t>
+      </w:r>
+      <w:proofErr w:type="spellEnd"/>
+      <w:r>
+        <w:rPr>
+          <w:rFonts w:ascii="Calibri" w:eastAsia="Calibri" w:hAnsi="Calibri" w:cs="Calibri"/>
+          <w:sz w:val="22"/>
+          <w:szCs w:val="22"/>
+        </w:rPr>
+        <w:t>.</w:t>
       </w:r>
     </w:p>
     <w:p>
@@ -2149,7 +4541,33 @@
           <w:sz w:val="22"/>
           <w:szCs w:val="22"/>
         </w:rPr>
-        <w:t>b) (4 pts) Escriba una lista por comprensión que combine, con and, la condición de (a) con la verificación de que el precio no sea None.</w:t>
+        <w:t>b</w:t>
+      </w:r>
+      <w:r>
+        <w:rPr>
+          <w:rFonts w:ascii="Calibri" w:eastAsia="Calibri" w:hAnsi="Calibri" w:cs="Calibri"/>
+          <w:sz w:val="22"/>
+          <w:szCs w:val="22"/>
+        </w:rPr>
+        <w:t xml:space="preserve">) (3 </w:t>
+      </w:r>
+      <w:proofErr w:type="spellStart"/>
+      <w:r>
+        <w:rPr>
+          <w:rFonts w:ascii="Calibri" w:eastAsia="Calibri" w:hAnsi="Calibri" w:cs="Calibri"/>
+          <w:sz w:val="22"/>
+          <w:szCs w:val="22"/>
+        </w:rPr>
+        <w:t>pts</w:t>
+      </w:r>
+      <w:proofErr w:type="spellEnd"/>
+      <w:r>
+        <w:rPr>
+          <w:rFonts w:ascii="Calibri" w:eastAsia="Calibri" w:hAnsi="Calibri" w:cs="Calibri"/>
+          <w:sz w:val="22"/>
+          <w:szCs w:val="22"/>
+        </w:rPr>
+        <w:t>) ¿Qué operador relacional usaría para descartar los precios negativos? Escriba la condición.</w:t>
       </w:r>
     </w:p>
     <w:p>
@@ -2167,7 +4585,79 @@
           <w:sz w:val="22"/>
           <w:szCs w:val="22"/>
         </w:rPr>
-        <w:t>c) (4 pts) Aplique un descuento del 12% a la lista limpia, generando una nueva lista (sin modificar la original). Explique cómo esto se relaciona con el hecho de que las listas son mutables pero list comprehension crea un objeto nuevo.</w:t>
+        <w:t xml:space="preserve">c) (4 </w:t>
+      </w:r>
+      <w:proofErr w:type="spellStart"/>
+      <w:r>
+        <w:rPr>
+          <w:rFonts w:ascii="Calibri" w:eastAsia="Calibri" w:hAnsi="Calibri" w:cs="Calibri"/>
+          <w:sz w:val="22"/>
+          <w:szCs w:val="22"/>
+        </w:rPr>
+        <w:t>pts</w:t>
+      </w:r>
+      <w:proofErr w:type="spellEnd"/>
+      <w:r>
+        <w:rPr>
+          <w:rFonts w:ascii="Calibri" w:eastAsia="Calibri" w:hAnsi="Calibri" w:cs="Calibri"/>
+          <w:sz w:val="22"/>
+          <w:szCs w:val="22"/>
+        </w:rPr>
+        <w:t xml:space="preserve">) Aplique un descuento del 12% a la lista limpia, generando una nueva lista (sin modificar la original). Explique cómo esto se relaciona con el hecho de que las listas son </w:t>
+      </w:r>
+      <w:proofErr w:type="gramStart"/>
+      <w:r>
+        <w:rPr>
+          <w:rFonts w:ascii="Calibri" w:eastAsia="Calibri" w:hAnsi="Calibri" w:cs="Calibri"/>
+          <w:sz w:val="22"/>
+          <w:szCs w:val="22"/>
+        </w:rPr>
+        <w:t>mutables</w:t>
+      </w:r>
+      <w:proofErr w:type="gramEnd"/>
+      <w:r>
+        <w:rPr>
+          <w:rFonts w:ascii="Calibri" w:eastAsia="Calibri" w:hAnsi="Calibri" w:cs="Calibri"/>
+          <w:sz w:val="22"/>
+          <w:szCs w:val="22"/>
+        </w:rPr>
+        <w:t xml:space="preserve"> pero </w:t>
+      </w:r>
+      <w:proofErr w:type="spellStart"/>
+      <w:r>
+        <w:rPr>
+          <w:rFonts w:ascii="Calibri" w:eastAsia="Calibri" w:hAnsi="Calibri" w:cs="Calibri"/>
+          <w:sz w:val="22"/>
+          <w:szCs w:val="22"/>
+        </w:rPr>
+        <w:t>list</w:t>
+      </w:r>
+      <w:proofErr w:type="spellEnd"/>
+      <w:r>
+        <w:rPr>
+          <w:rFonts w:ascii="Calibri" w:eastAsia="Calibri" w:hAnsi="Calibri" w:cs="Calibri"/>
+          <w:sz w:val="22"/>
+          <w:szCs w:val="22"/>
+        </w:rPr>
+        <w:t xml:space="preserve"> </w:t>
+      </w:r>
+      <w:proofErr w:type="spellStart"/>
+      <w:r>
+        <w:rPr>
+          <w:rFonts w:ascii="Calibri" w:eastAsia="Calibri" w:hAnsi="Calibri" w:cs="Calibri"/>
+          <w:sz w:val="22"/>
+          <w:szCs w:val="22"/>
+        </w:rPr>
+        <w:t>comprehension</w:t>
+      </w:r>
+      <w:proofErr w:type="spellEnd"/>
+      <w:r>
+        <w:rPr>
+          <w:rFonts w:ascii="Calibri" w:eastAsia="Calibri" w:hAnsi="Calibri" w:cs="Calibri"/>
+          <w:sz w:val="22"/>
+          <w:szCs w:val="22"/>
+        </w:rPr>
+        <w:t xml:space="preserve"> crea un objeto nuevo.</w:t>
       </w:r>
     </w:p>
     <w:p>
@@ -2185,7 +4675,25 @@
           <w:sz w:val="22"/>
           <w:szCs w:val="22"/>
         </w:rPr>
-        <w:t>d) (3 pts) Verifique con el operador in si el valor 23000 pertenece a la lista original de precios.</w:t>
+        <w:t xml:space="preserve">d) (3 </w:t>
+      </w:r>
+      <w:proofErr w:type="spellStart"/>
+      <w:r>
+        <w:rPr>
+          <w:rFonts w:ascii="Calibri" w:eastAsia="Calibri" w:hAnsi="Calibri" w:cs="Calibri"/>
+          <w:sz w:val="22"/>
+          <w:szCs w:val="22"/>
+        </w:rPr>
+        <w:t>pts</w:t>
+      </w:r>
+      <w:proofErr w:type="spellEnd"/>
+      <w:r>
+        <w:rPr>
+          <w:rFonts w:ascii="Calibri" w:eastAsia="Calibri" w:hAnsi="Calibri" w:cs="Calibri"/>
+          <w:sz w:val="22"/>
+          <w:szCs w:val="22"/>
+        </w:rPr>
+        <w:t>) Verifique con el operador in si el valor 23000 pertenece a la lista original de precios.</w:t>
       </w:r>
     </w:p>
     <w:p>
@@ -2194,7 +4702,15 @@
         <w:spacing w:before="250" w:after="120"/>
       </w:pPr>
       <w:r>
-        <w:t>C3. El boletín de notas  (12 puntos)</w:t>
+        <w:t xml:space="preserve">C3. El boletín de </w:t>
+      </w:r>
+      <w:proofErr w:type="gramStart"/>
+      <w:r>
+        <w:t>notas  (</w:t>
+      </w:r>
+      <w:proofErr w:type="gramEnd"/>
+      <w:r>
+        <w:t>12 puntos)</w:t>
       </w:r>
     </w:p>
     <w:p>
@@ -2225,7 +4741,43 @@
           <w:sz w:val="22"/>
           <w:szCs w:val="22"/>
         </w:rPr>
-        <w:t>a) (4 pts) Cree las variables necesarias y calcule la nota_final usando operadores aritméticos. Indique el tipo de dato resultante.</w:t>
+        <w:t xml:space="preserve">a) (4 </w:t>
+      </w:r>
+      <w:proofErr w:type="spellStart"/>
+      <w:r>
+        <w:rPr>
+          <w:rFonts w:ascii="Calibri" w:eastAsia="Calibri" w:hAnsi="Calibri" w:cs="Calibri"/>
+          <w:sz w:val="22"/>
+          <w:szCs w:val="22"/>
+        </w:rPr>
+        <w:t>pts</w:t>
+      </w:r>
+      <w:proofErr w:type="spellEnd"/>
+      <w:r>
+        <w:rPr>
+          <w:rFonts w:ascii="Calibri" w:eastAsia="Calibri" w:hAnsi="Calibri" w:cs="Calibri"/>
+          <w:sz w:val="22"/>
+          <w:szCs w:val="22"/>
+        </w:rPr>
+        <w:t xml:space="preserve">) Cree las variables necesarias y calcule la </w:t>
+      </w:r>
+      <w:proofErr w:type="spellStart"/>
+      <w:r>
+        <w:rPr>
+          <w:rFonts w:ascii="Calibri" w:eastAsia="Calibri" w:hAnsi="Calibri" w:cs="Calibri"/>
+          <w:sz w:val="22"/>
+          <w:szCs w:val="22"/>
+        </w:rPr>
+        <w:t>nota_final</w:t>
+      </w:r>
+      <w:proofErr w:type="spellEnd"/>
+      <w:r>
+        <w:rPr>
+          <w:rFonts w:ascii="Calibri" w:eastAsia="Calibri" w:hAnsi="Calibri" w:cs="Calibri"/>
+          <w:sz w:val="22"/>
+          <w:szCs w:val="22"/>
+        </w:rPr>
+        <w:t xml:space="preserve"> usando operadores aritméticos. Indique el tipo de dato resultante.</w:t>
       </w:r>
     </w:p>
     <w:p>
@@ -2243,7 +4795,97 @@
           <w:sz w:val="22"/>
           <w:szCs w:val="22"/>
         </w:rPr>
-        <w:t>b) (4 pts) Escriba una expresión lógica que determine si el estudiante “aprueba con distinción” (nota_final &gt;= 4.5) o simplemente “aprueba” (nota_final &gt;= 3.0 and nota_final &lt; 4.5). Use and/or según corresponda.</w:t>
+        <w:t xml:space="preserve">b) (4 </w:t>
+      </w:r>
+      <w:proofErr w:type="spellStart"/>
+      <w:r>
+        <w:rPr>
+          <w:rFonts w:ascii="Calibri" w:eastAsia="Calibri" w:hAnsi="Calibri" w:cs="Calibri"/>
+          <w:sz w:val="22"/>
+          <w:szCs w:val="22"/>
+        </w:rPr>
+        <w:t>pts</w:t>
+      </w:r>
+      <w:proofErr w:type="spellEnd"/>
+      <w:r>
+        <w:rPr>
+          <w:rFonts w:ascii="Calibri" w:eastAsia="Calibri" w:hAnsi="Calibri" w:cs="Calibri"/>
+          <w:sz w:val="22"/>
+          <w:szCs w:val="22"/>
+        </w:rPr>
+        <w:t>) Escriba una expresión lógica que determine si el estudiante “aprueba con distinción” (</w:t>
+      </w:r>
+      <w:proofErr w:type="spellStart"/>
+      <w:r>
+        <w:rPr>
+          <w:rFonts w:ascii="Calibri" w:eastAsia="Calibri" w:hAnsi="Calibri" w:cs="Calibri"/>
+          <w:sz w:val="22"/>
+          <w:szCs w:val="22"/>
+        </w:rPr>
+        <w:t>nota_final</w:t>
+      </w:r>
+      <w:proofErr w:type="spellEnd"/>
+      <w:r>
+        <w:rPr>
+          <w:rFonts w:ascii="Calibri" w:eastAsia="Calibri" w:hAnsi="Calibri" w:cs="Calibri"/>
+          <w:sz w:val="22"/>
+          <w:szCs w:val="22"/>
+        </w:rPr>
+        <w:t xml:space="preserve"> &gt;= 4.5) o simplemente “aprueba” (</w:t>
+      </w:r>
+      <w:proofErr w:type="spellStart"/>
+      <w:r>
+        <w:rPr>
+          <w:rFonts w:ascii="Calibri" w:eastAsia="Calibri" w:hAnsi="Calibri" w:cs="Calibri"/>
+          <w:sz w:val="22"/>
+          <w:szCs w:val="22"/>
+        </w:rPr>
+        <w:t>nota_final</w:t>
+      </w:r>
+      <w:proofErr w:type="spellEnd"/>
+      <w:r>
+        <w:rPr>
+          <w:rFonts w:ascii="Calibri" w:eastAsia="Calibri" w:hAnsi="Calibri" w:cs="Calibri"/>
+          <w:sz w:val="22"/>
+          <w:szCs w:val="22"/>
+        </w:rPr>
+        <w:t xml:space="preserve"> &gt;= 3.0 and </w:t>
+      </w:r>
+      <w:proofErr w:type="spellStart"/>
+      <w:r>
+        <w:rPr>
+          <w:rFonts w:ascii="Calibri" w:eastAsia="Calibri" w:hAnsi="Calibri" w:cs="Calibri"/>
+          <w:sz w:val="22"/>
+          <w:szCs w:val="22"/>
+        </w:rPr>
+        <w:t>nota_final</w:t>
+      </w:r>
+      <w:proofErr w:type="spellEnd"/>
+      <w:r>
+        <w:rPr>
+          <w:rFonts w:ascii="Calibri" w:eastAsia="Calibri" w:hAnsi="Calibri" w:cs="Calibri"/>
+          <w:sz w:val="22"/>
+          <w:szCs w:val="22"/>
+        </w:rPr>
+        <w:t xml:space="preserve"> &lt; 4.5). Use and/</w:t>
+      </w:r>
+      <w:proofErr w:type="spellStart"/>
+      <w:r>
+        <w:rPr>
+          <w:rFonts w:ascii="Calibri" w:eastAsia="Calibri" w:hAnsi="Calibri" w:cs="Calibri"/>
+          <w:sz w:val="22"/>
+          <w:szCs w:val="22"/>
+        </w:rPr>
+        <w:t>or</w:t>
+      </w:r>
+      <w:proofErr w:type="spellEnd"/>
+      <w:r>
+        <w:rPr>
+          <w:rFonts w:ascii="Calibri" w:eastAsia="Calibri" w:hAnsi="Calibri" w:cs="Calibri"/>
+          <w:sz w:val="22"/>
+          <w:szCs w:val="22"/>
+        </w:rPr>
+        <w:t xml:space="preserve"> según corresponda.</w:t>
       </w:r>
     </w:p>
     <w:p>
@@ -2261,7 +4903,43 @@
           <w:sz w:val="22"/>
           <w:szCs w:val="22"/>
         </w:rPr>
-        <w:t>c) (4 pts) El sistema debe además marcar “en riesgo de perder por inasistencia” si la asistencia &lt; 80% incluso si la nota_final es aprobatoria. Escriba la expresión lógica compuesta completa que decide si el estudiante finalmente pierde la materia.</w:t>
+        <w:t xml:space="preserve">c) (4 </w:t>
+      </w:r>
+      <w:proofErr w:type="spellStart"/>
+      <w:r>
+        <w:rPr>
+          <w:rFonts w:ascii="Calibri" w:eastAsia="Calibri" w:hAnsi="Calibri" w:cs="Calibri"/>
+          <w:sz w:val="22"/>
+          <w:szCs w:val="22"/>
+        </w:rPr>
+        <w:t>pts</w:t>
+      </w:r>
+      <w:proofErr w:type="spellEnd"/>
+      <w:r>
+        <w:rPr>
+          <w:rFonts w:ascii="Calibri" w:eastAsia="Calibri" w:hAnsi="Calibri" w:cs="Calibri"/>
+          <w:sz w:val="22"/>
+          <w:szCs w:val="22"/>
+        </w:rPr>
+        <w:t xml:space="preserve">) El sistema debe además marcar “en riesgo de perder por inasistencia” si la asistencia &lt; 80% incluso si la </w:t>
+      </w:r>
+      <w:proofErr w:type="spellStart"/>
+      <w:r>
+        <w:rPr>
+          <w:rFonts w:ascii="Calibri" w:eastAsia="Calibri" w:hAnsi="Calibri" w:cs="Calibri"/>
+          <w:sz w:val="22"/>
+          <w:szCs w:val="22"/>
+        </w:rPr>
+        <w:t>nota_final</w:t>
+      </w:r>
+      <w:proofErr w:type="spellEnd"/>
+      <w:r>
+        <w:rPr>
+          <w:rFonts w:ascii="Calibri" w:eastAsia="Calibri" w:hAnsi="Calibri" w:cs="Calibri"/>
+          <w:sz w:val="22"/>
+          <w:szCs w:val="22"/>
+        </w:rPr>
+        <w:t xml:space="preserve"> es aprobatoria. Escriba la expresión lógica compuesta completa que decide si el estudiante finalmente pierde la materia.</w:t>
       </w:r>
     </w:p>
     <w:p>
@@ -2270,7 +4948,15 @@
         <w:spacing w:before="250" w:after="120"/>
       </w:pPr>
       <w:r>
-        <w:t>C4. El ahorro mensual con interés  (12 puntos)</w:t>
+        <w:t xml:space="preserve">C4. El ahorro mensual con </w:t>
+      </w:r>
+      <w:proofErr w:type="gramStart"/>
+      <w:r>
+        <w:t>interés  (</w:t>
+      </w:r>
+      <w:proofErr w:type="gramEnd"/>
+      <w:r>
+        <w:t>12 puntos)</w:t>
       </w:r>
     </w:p>
     <w:p>
@@ -2314,7 +5000,25 @@
           <w:sz w:val="22"/>
           <w:szCs w:val="22"/>
         </w:rPr>
-        <w:t>a) (5 pts) Usando operadores de asignación compuestos (+=, *=), escriba el código que simule 4 meses de ahorro con interés, mostrando el saldo después de cada mes.</w:t>
+        <w:t xml:space="preserve">a) (5 </w:t>
+      </w:r>
+      <w:proofErr w:type="spellStart"/>
+      <w:r>
+        <w:rPr>
+          <w:rFonts w:ascii="Calibri" w:eastAsia="Calibri" w:hAnsi="Calibri" w:cs="Calibri"/>
+          <w:sz w:val="22"/>
+          <w:szCs w:val="22"/>
+        </w:rPr>
+        <w:t>pts</w:t>
+      </w:r>
+      <w:proofErr w:type="spellEnd"/>
+      <w:r>
+        <w:rPr>
+          <w:rFonts w:ascii="Calibri" w:eastAsia="Calibri" w:hAnsi="Calibri" w:cs="Calibri"/>
+          <w:sz w:val="22"/>
+          <w:szCs w:val="22"/>
+        </w:rPr>
+        <w:t>) Usando operadores de asignación compuestos (+=, *=), escriba el código que simule 4 meses de ahorro con interés, mostrando el saldo después de cada mes.</w:t>
       </w:r>
     </w:p>
     <w:p>
@@ -2333,7 +5037,25 @@
           <w:szCs w:val="22"/>
         </w:rPr>
         <w:lastRenderedPageBreak/>
-        <w:t>b) (3 pts) Use un operador relacional para verificar si, después de los 4 meses, el saldo superó 850 000 pesos.</w:t>
+        <w:t xml:space="preserve">b) (3 </w:t>
+      </w:r>
+      <w:proofErr w:type="spellStart"/>
+      <w:r>
+        <w:rPr>
+          <w:rFonts w:ascii="Calibri" w:eastAsia="Calibri" w:hAnsi="Calibri" w:cs="Calibri"/>
+          <w:sz w:val="22"/>
+          <w:szCs w:val="22"/>
+        </w:rPr>
+        <w:t>pts</w:t>
+      </w:r>
+      <w:proofErr w:type="spellEnd"/>
+      <w:r>
+        <w:rPr>
+          <w:rFonts w:ascii="Calibri" w:eastAsia="Calibri" w:hAnsi="Calibri" w:cs="Calibri"/>
+          <w:sz w:val="22"/>
+          <w:szCs w:val="22"/>
+        </w:rPr>
+        <w:t>) Use un operador relacional para verificar si, después de los 4 meses, el saldo superó 850 000 pesos.</w:t>
       </w:r>
     </w:p>
     <w:p>
@@ -2351,7 +5073,25 @@
           <w:sz w:val="22"/>
           <w:szCs w:val="22"/>
         </w:rPr>
-        <w:t>c) (4 pts) Explique, con sus palabras, por qué saldo *= 1.01 es equivalente a saldo = saldo * 1.01, y por qué a esto se le llama “azúcar sintáctico”.</w:t>
+        <w:t xml:space="preserve">c) (4 </w:t>
+      </w:r>
+      <w:proofErr w:type="spellStart"/>
+      <w:r>
+        <w:rPr>
+          <w:rFonts w:ascii="Calibri" w:eastAsia="Calibri" w:hAnsi="Calibri" w:cs="Calibri"/>
+          <w:sz w:val="22"/>
+          <w:szCs w:val="22"/>
+        </w:rPr>
+        <w:t>pts</w:t>
+      </w:r>
+      <w:proofErr w:type="spellEnd"/>
+      <w:r>
+        <w:rPr>
+          <w:rFonts w:ascii="Calibri" w:eastAsia="Calibri" w:hAnsi="Calibri" w:cs="Calibri"/>
+          <w:sz w:val="22"/>
+          <w:szCs w:val="22"/>
+        </w:rPr>
+        <w:t>) Explique, con sus palabras, por qué saldo *= 1.01 es equivalente a saldo = saldo * 1.01, y por qué a esto se le llama “azúcar sintáctico”.</w:t>
       </w:r>
     </w:p>
     <w:p>
@@ -2360,7 +5100,15 @@
         <w:spacing w:before="250" w:after="120"/>
       </w:pPr>
       <w:r>
-        <w:t>C5. Control de acceso a la biblioteca  (14 puntos)</w:t>
+        <w:t xml:space="preserve">C5. Control de acceso a la </w:t>
+      </w:r>
+      <w:proofErr w:type="gramStart"/>
+      <w:r>
+        <w:t>biblioteca  (</w:t>
+      </w:r>
+      <w:proofErr w:type="gramEnd"/>
+      <w:r>
+        <w:t>14 puntos)</w:t>
       </w:r>
     </w:p>
     <w:p>
@@ -2382,47 +5130,87 @@
         <w:spacing w:before="60" w:after="120"/>
         <w:ind w:left="360"/>
       </w:pPr>
+      <w:proofErr w:type="spellStart"/>
       <w:r>
         <w:rPr>
           <w:rFonts w:ascii="Consolas" w:eastAsia="Consolas" w:hAnsi="Consolas" w:cs="Consolas"/>
         </w:rPr>
-        <w:t>es_profesor = False</w:t>
+        <w:t>es_profesor</w:t>
+      </w:r>
+      <w:proofErr w:type="spellEnd"/>
+      <w:r>
+        <w:rPr>
+          <w:rFonts w:ascii="Consolas" w:eastAsia="Consolas" w:hAnsi="Consolas" w:cs="Consolas"/>
+        </w:rPr>
+        <w:t xml:space="preserve"> = False</w:t>
       </w:r>
       <w:r>
         <w:br/>
       </w:r>
+      <w:proofErr w:type="spellStart"/>
       <w:r>
         <w:rPr>
           <w:rFonts w:ascii="Consolas" w:eastAsia="Consolas" w:hAnsi="Consolas" w:cs="Consolas"/>
         </w:rPr>
-        <w:t>matricula_activa = True</w:t>
+        <w:t>matricula_activa</w:t>
+      </w:r>
+      <w:proofErr w:type="spellEnd"/>
+      <w:r>
+        <w:rPr>
+          <w:rFonts w:ascii="Consolas" w:eastAsia="Consolas" w:hAnsi="Consolas" w:cs="Consolas"/>
+        </w:rPr>
+        <w:t xml:space="preserve"> = True</w:t>
       </w:r>
       <w:r>
         <w:br/>
       </w:r>
+      <w:proofErr w:type="spellStart"/>
       <w:r>
         <w:rPr>
           <w:rFonts w:ascii="Consolas" w:eastAsia="Consolas" w:hAnsi="Consolas" w:cs="Consolas"/>
         </w:rPr>
-        <w:t>libros_vencidos = 1</w:t>
+        <w:t>libros_vencidos</w:t>
+      </w:r>
+      <w:proofErr w:type="spellEnd"/>
+      <w:r>
+        <w:rPr>
+          <w:rFonts w:ascii="Consolas" w:eastAsia="Consolas" w:hAnsi="Consolas" w:cs="Consolas"/>
+        </w:rPr>
+        <w:t xml:space="preserve"> = 1</w:t>
       </w:r>
       <w:r>
         <w:br/>
       </w:r>
+      <w:proofErr w:type="spellStart"/>
       <w:r>
         <w:rPr>
           <w:rFonts w:ascii="Consolas" w:eastAsia="Consolas" w:hAnsi="Consolas" w:cs="Consolas"/>
         </w:rPr>
-        <w:t>usuarios_bloqueados = {"est_045", "est_102", "est_198"}</w:t>
+        <w:t>usuarios_bloqueados</w:t>
+      </w:r>
+      <w:proofErr w:type="spellEnd"/>
+      <w:r>
+        <w:rPr>
+          <w:rFonts w:ascii="Consolas" w:eastAsia="Consolas" w:hAnsi="Consolas" w:cs="Consolas"/>
+        </w:rPr>
+        <w:t xml:space="preserve"> = {"est_045", "est_102", "est_198"}</w:t>
       </w:r>
       <w:r>
         <w:br/>
       </w:r>
+      <w:proofErr w:type="spellStart"/>
       <w:r>
         <w:rPr>
           <w:rFonts w:ascii="Consolas" w:eastAsia="Consolas" w:hAnsi="Consolas" w:cs="Consolas"/>
         </w:rPr>
-        <w:t>codigo_usuario = "est_102"</w:t>
+        <w:t>codigo_usuario</w:t>
+      </w:r>
+      <w:proofErr w:type="spellEnd"/>
+      <w:r>
+        <w:rPr>
+          <w:rFonts w:ascii="Consolas" w:eastAsia="Consolas" w:hAnsi="Consolas" w:cs="Consolas"/>
+        </w:rPr>
+        <w:t xml:space="preserve"> = "est_102"</w:t>
       </w:r>
     </w:p>
     <w:p>
@@ -2440,7 +5228,61 @@
           <w:sz w:val="22"/>
           <w:szCs w:val="22"/>
         </w:rPr>
-        <w:t>a) (5 pts) Escriba la expresión lógica compuesta (usando and, or, not) que decida si el usuario puede llevar un libro, según la regla del enunciado.</w:t>
+        <w:t xml:space="preserve">a) (5 </w:t>
+      </w:r>
+      <w:proofErr w:type="spellStart"/>
+      <w:r>
+        <w:rPr>
+          <w:rFonts w:ascii="Calibri" w:eastAsia="Calibri" w:hAnsi="Calibri" w:cs="Calibri"/>
+          <w:sz w:val="22"/>
+          <w:szCs w:val="22"/>
+        </w:rPr>
+        <w:t>pts</w:t>
+      </w:r>
+      <w:proofErr w:type="spellEnd"/>
+      <w:r>
+        <w:rPr>
+          <w:rFonts w:ascii="Calibri" w:eastAsia="Calibri" w:hAnsi="Calibri" w:cs="Calibri"/>
+          <w:sz w:val="22"/>
+          <w:szCs w:val="22"/>
+        </w:rPr>
+        <w:t xml:space="preserve">) Escriba la expresión lógica compuesta (usando and, </w:t>
+      </w:r>
+      <w:proofErr w:type="spellStart"/>
+      <w:r>
+        <w:rPr>
+          <w:rFonts w:ascii="Calibri" w:eastAsia="Calibri" w:hAnsi="Calibri" w:cs="Calibri"/>
+          <w:sz w:val="22"/>
+          <w:szCs w:val="22"/>
+        </w:rPr>
+        <w:t>or</w:t>
+      </w:r>
+      <w:proofErr w:type="spellEnd"/>
+      <w:r>
+        <w:rPr>
+          <w:rFonts w:ascii="Calibri" w:eastAsia="Calibri" w:hAnsi="Calibri" w:cs="Calibri"/>
+          <w:sz w:val="22"/>
+          <w:szCs w:val="22"/>
+        </w:rPr>
+        <w:t xml:space="preserve">, </w:t>
+      </w:r>
+      <w:proofErr w:type="spellStart"/>
+      <w:r>
+        <w:rPr>
+          <w:rFonts w:ascii="Calibri" w:eastAsia="Calibri" w:hAnsi="Calibri" w:cs="Calibri"/>
+          <w:sz w:val="22"/>
+          <w:szCs w:val="22"/>
+        </w:rPr>
+        <w:t>not</w:t>
+      </w:r>
+      <w:proofErr w:type="spellEnd"/>
+      <w:r>
+        <w:rPr>
+          <w:rFonts w:ascii="Calibri" w:eastAsia="Calibri" w:hAnsi="Calibri" w:cs="Calibri"/>
+          <w:sz w:val="22"/>
+          <w:szCs w:val="22"/>
+        </w:rPr>
+        <w:t>) que decida si el usuario puede llevar un libro, según la regla del enunciado.</w:t>
       </w:r>
     </w:p>
     <w:p>
@@ -2458,7 +5300,79 @@
           <w:sz w:val="22"/>
           <w:szCs w:val="22"/>
         </w:rPr>
-        <w:t>b) (4 pts) Use el operador de pertenencia para verificar si codigo_usuario está en la lista de usuarios_bloqueados, y combine este resultado con la expresión de (a) usando not.</w:t>
+        <w:t xml:space="preserve">b) (4 </w:t>
+      </w:r>
+      <w:proofErr w:type="spellStart"/>
+      <w:r>
+        <w:rPr>
+          <w:rFonts w:ascii="Calibri" w:eastAsia="Calibri" w:hAnsi="Calibri" w:cs="Calibri"/>
+          <w:sz w:val="22"/>
+          <w:szCs w:val="22"/>
+        </w:rPr>
+        <w:t>pts</w:t>
+      </w:r>
+      <w:proofErr w:type="spellEnd"/>
+      <w:r>
+        <w:rPr>
+          <w:rFonts w:ascii="Calibri" w:eastAsia="Calibri" w:hAnsi="Calibri" w:cs="Calibri"/>
+          <w:sz w:val="22"/>
+          <w:szCs w:val="22"/>
+        </w:rPr>
+        <w:t xml:space="preserve">) Use el operador de pertenencia para verificar si </w:t>
+      </w:r>
+      <w:proofErr w:type="spellStart"/>
+      <w:r>
+        <w:rPr>
+          <w:rFonts w:ascii="Calibri" w:eastAsia="Calibri" w:hAnsi="Calibri" w:cs="Calibri"/>
+          <w:sz w:val="22"/>
+          <w:szCs w:val="22"/>
+        </w:rPr>
+        <w:t>codigo_usuario</w:t>
+      </w:r>
+      <w:proofErr w:type="spellEnd"/>
+      <w:r>
+        <w:rPr>
+          <w:rFonts w:ascii="Calibri" w:eastAsia="Calibri" w:hAnsi="Calibri" w:cs="Calibri"/>
+          <w:sz w:val="22"/>
+          <w:szCs w:val="22"/>
+        </w:rPr>
+        <w:t xml:space="preserve"> está en la lista de </w:t>
+      </w:r>
+      <w:proofErr w:type="spellStart"/>
+      <w:r>
+        <w:rPr>
+          <w:rFonts w:ascii="Calibri" w:eastAsia="Calibri" w:hAnsi="Calibri" w:cs="Calibri"/>
+          <w:sz w:val="22"/>
+          <w:szCs w:val="22"/>
+        </w:rPr>
+        <w:t>usuarios_bloqueados</w:t>
+      </w:r>
+      <w:proofErr w:type="spellEnd"/>
+      <w:r>
+        <w:rPr>
+          <w:rFonts w:ascii="Calibri" w:eastAsia="Calibri" w:hAnsi="Calibri" w:cs="Calibri"/>
+          <w:sz w:val="22"/>
+          <w:szCs w:val="22"/>
+        </w:rPr>
+        <w:t xml:space="preserve">, y combine este resultado con la expresión de (a) usando </w:t>
+      </w:r>
+      <w:proofErr w:type="spellStart"/>
+      <w:r>
+        <w:rPr>
+          <w:rFonts w:ascii="Calibri" w:eastAsia="Calibri" w:hAnsi="Calibri" w:cs="Calibri"/>
+          <w:sz w:val="22"/>
+          <w:szCs w:val="22"/>
+        </w:rPr>
+        <w:t>not</w:t>
+      </w:r>
+      <w:proofErr w:type="spellEnd"/>
+      <w:r>
+        <w:rPr>
+          <w:rFonts w:ascii="Calibri" w:eastAsia="Calibri" w:hAnsi="Calibri" w:cs="Calibri"/>
+          <w:sz w:val="22"/>
+          <w:szCs w:val="22"/>
+        </w:rPr>
+        <w:t>.</w:t>
       </w:r>
     </w:p>
     <w:p>
@@ -2476,7 +5390,61 @@
           <w:sz w:val="22"/>
           <w:szCs w:val="22"/>
         </w:rPr>
-        <w:t>c) (5 pts) Explique por qué, para una universidad con decenas de miles de estudiantes, representar usuarios_bloqueados como set y no como list mejora el rendimiento de esta verificación. Relacione su respuesta con la complejidad de búsqueda estudiada en el curso.</w:t>
+        <w:t xml:space="preserve">c) (5 </w:t>
+      </w:r>
+      <w:proofErr w:type="spellStart"/>
+      <w:r>
+        <w:rPr>
+          <w:rFonts w:ascii="Calibri" w:eastAsia="Calibri" w:hAnsi="Calibri" w:cs="Calibri"/>
+          <w:sz w:val="22"/>
+          <w:szCs w:val="22"/>
+        </w:rPr>
+        <w:t>pts</w:t>
+      </w:r>
+      <w:proofErr w:type="spellEnd"/>
+      <w:r>
+        <w:rPr>
+          <w:rFonts w:ascii="Calibri" w:eastAsia="Calibri" w:hAnsi="Calibri" w:cs="Calibri"/>
+          <w:sz w:val="22"/>
+          <w:szCs w:val="22"/>
+        </w:rPr>
+        <w:t xml:space="preserve">) Explique por qué, para una universidad con decenas de miles de estudiantes, representar </w:t>
+      </w:r>
+      <w:proofErr w:type="spellStart"/>
+      <w:r>
+        <w:rPr>
+          <w:rFonts w:ascii="Calibri" w:eastAsia="Calibri" w:hAnsi="Calibri" w:cs="Calibri"/>
+          <w:sz w:val="22"/>
+          <w:szCs w:val="22"/>
+        </w:rPr>
+        <w:t>usuarios_bloqueados</w:t>
+      </w:r>
+      <w:proofErr w:type="spellEnd"/>
+      <w:r>
+        <w:rPr>
+          <w:rFonts w:ascii="Calibri" w:eastAsia="Calibri" w:hAnsi="Calibri" w:cs="Calibri"/>
+          <w:sz w:val="22"/>
+          <w:szCs w:val="22"/>
+        </w:rPr>
+        <w:t xml:space="preserve"> como set y no como </w:t>
+      </w:r>
+      <w:proofErr w:type="spellStart"/>
+      <w:r>
+        <w:rPr>
+          <w:rFonts w:ascii="Calibri" w:eastAsia="Calibri" w:hAnsi="Calibri" w:cs="Calibri"/>
+          <w:sz w:val="22"/>
+          <w:szCs w:val="22"/>
+        </w:rPr>
+        <w:t>list</w:t>
+      </w:r>
+      <w:proofErr w:type="spellEnd"/>
+      <w:r>
+        <w:rPr>
+          <w:rFonts w:ascii="Calibri" w:eastAsia="Calibri" w:hAnsi="Calibri" w:cs="Calibri"/>
+          <w:sz w:val="22"/>
+          <w:szCs w:val="22"/>
+        </w:rPr>
+        <w:t xml:space="preserve"> mejora el rendimiento de esta verificación. Relacione su respuesta con la complejidad de búsqueda estudiada en el curso.</w:t>
       </w:r>
     </w:p>
     <w:p>
@@ -2560,7 +5528,15 @@
       </w:pPr>
       <w:r>
         <w:lastRenderedPageBreak/>
-        <w:t>Bloque D — Reto opcional  (10 puntos de bono)</w:t>
+        <w:t xml:space="preserve">Bloque D — Reto </w:t>
+      </w:r>
+      <w:proofErr w:type="gramStart"/>
+      <w:r>
+        <w:t>opcional  (</w:t>
+      </w:r>
+      <w:proofErr w:type="gramEnd"/>
+      <w:r>
+        <w:t>10 puntos de bono)</w:t>
       </w:r>
     </w:p>
     <w:p>
@@ -2573,7 +5549,25 @@
           <w:sz w:val="22"/>
           <w:szCs w:val="22"/>
         </w:rPr>
-        <w:t xml:space="preserve">Sea la sucesión definida por x₀ = 1.6  y  x_(n+1) = </w:t>
+        <w:t xml:space="preserve">Sea la sucesión definida por x₀ = </w:t>
+      </w:r>
+      <w:proofErr w:type="gramStart"/>
+      <w:r>
+        <w:rPr>
+          <w:rFonts w:ascii="Calibri" w:eastAsia="Calibri" w:hAnsi="Calibri" w:cs="Calibri"/>
+          <w:sz w:val="22"/>
+          <w:szCs w:val="22"/>
+        </w:rPr>
+        <w:t>1.6  y</w:t>
+      </w:r>
+      <w:proofErr w:type="gramEnd"/>
+      <w:r>
+        <w:rPr>
+          <w:rFonts w:ascii="Calibri" w:eastAsia="Calibri" w:hAnsi="Calibri" w:cs="Calibri"/>
+          <w:sz w:val="22"/>
+          <w:szCs w:val="22"/>
+        </w:rPr>
+        <w:t xml:space="preserve">  x_(n+1) = </w:t>
       </w:r>
       <w:r>
         <w:rPr>
@@ -2583,14 +5577,25 @@
         </w:rPr>
         <w:t>(</w:t>
       </w:r>
-      <w:r>
-        <w:rPr>
-          <w:rFonts w:ascii="Calibri" w:eastAsia="Calibri" w:hAnsi="Calibri" w:cs="Calibri"/>
-          <w:sz w:val="22"/>
-          <w:szCs w:val="22"/>
-        </w:rPr>
-        <w:t>x_n</w:t>
-      </w:r>
+      <w:proofErr w:type="spellStart"/>
+      <w:r>
+        <w:rPr>
+          <w:rFonts w:ascii="Calibri" w:eastAsia="Calibri" w:hAnsi="Calibri" w:cs="Calibri"/>
+          <w:sz w:val="22"/>
+          <w:szCs w:val="22"/>
+        </w:rPr>
+        <w:t>x_</w:t>
+      </w:r>
+      <w:proofErr w:type="gramStart"/>
+      <w:r>
+        <w:rPr>
+          <w:rFonts w:ascii="Calibri" w:eastAsia="Calibri" w:hAnsi="Calibri" w:cs="Calibri"/>
+          <w:sz w:val="22"/>
+          <w:szCs w:val="22"/>
+        </w:rPr>
+        <w:t>n</w:t>
+      </w:r>
+      <w:proofErr w:type="spellEnd"/>
       <w:r>
         <w:rPr>
           <w:rFonts w:ascii="Calibri" w:eastAsia="Calibri" w:hAnsi="Calibri" w:cs="Calibri"/>
@@ -2605,7 +5610,16 @@
           <w:sz w:val="22"/>
           <w:szCs w:val="22"/>
         </w:rPr>
-        <w:t>² − 2.</w:t>
+        <w:t>²</w:t>
+      </w:r>
+      <w:proofErr w:type="gramEnd"/>
+      <w:r>
+        <w:rPr>
+          <w:rFonts w:ascii="Calibri" w:eastAsia="Calibri" w:hAnsi="Calibri" w:cs="Calibri"/>
+          <w:sz w:val="22"/>
+          <w:szCs w:val="22"/>
+        </w:rPr>
+        <w:t xml:space="preserve"> − 2.</w:t>
       </w:r>
     </w:p>
     <w:p>
@@ -2623,7 +5637,25 @@
           <w:sz w:val="22"/>
           <w:szCs w:val="22"/>
         </w:rPr>
-        <w:t>a) (4 pts) Calcule las primeras 6 iteraciones usando un operador de asignación compuesto dentro de un ciclo.</w:t>
+        <w:t xml:space="preserve">a) (4 </w:t>
+      </w:r>
+      <w:proofErr w:type="spellStart"/>
+      <w:r>
+        <w:rPr>
+          <w:rFonts w:ascii="Calibri" w:eastAsia="Calibri" w:hAnsi="Calibri" w:cs="Calibri"/>
+          <w:sz w:val="22"/>
+          <w:szCs w:val="22"/>
+        </w:rPr>
+        <w:t>pts</w:t>
+      </w:r>
+      <w:proofErr w:type="spellEnd"/>
+      <w:r>
+        <w:rPr>
+          <w:rFonts w:ascii="Calibri" w:eastAsia="Calibri" w:hAnsi="Calibri" w:cs="Calibri"/>
+          <w:sz w:val="22"/>
+          <w:szCs w:val="22"/>
+        </w:rPr>
+        <w:t>) Calcule las primeras 6 iteraciones usando un operador de asignación compuesto dentro de un ciclo.</w:t>
       </w:r>
     </w:p>
     <w:p>
@@ -2641,7 +5673,43 @@
           <w:sz w:val="22"/>
           <w:szCs w:val="22"/>
         </w:rPr>
-        <w:t>b) (3 pts) En cada paso, use un operador relacional para verificar si x_n &gt; 1.9.</w:t>
+        <w:t xml:space="preserve">b) (3 </w:t>
+      </w:r>
+      <w:proofErr w:type="spellStart"/>
+      <w:r>
+        <w:rPr>
+          <w:rFonts w:ascii="Calibri" w:eastAsia="Calibri" w:hAnsi="Calibri" w:cs="Calibri"/>
+          <w:sz w:val="22"/>
+          <w:szCs w:val="22"/>
+        </w:rPr>
+        <w:t>pts</w:t>
+      </w:r>
+      <w:proofErr w:type="spellEnd"/>
+      <w:r>
+        <w:rPr>
+          <w:rFonts w:ascii="Calibri" w:eastAsia="Calibri" w:hAnsi="Calibri" w:cs="Calibri"/>
+          <w:sz w:val="22"/>
+          <w:szCs w:val="22"/>
+        </w:rPr>
+        <w:t xml:space="preserve">) En cada paso, use un operador relacional para verificar si </w:t>
+      </w:r>
+      <w:proofErr w:type="spellStart"/>
+      <w:r>
+        <w:rPr>
+          <w:rFonts w:ascii="Calibri" w:eastAsia="Calibri" w:hAnsi="Calibri" w:cs="Calibri"/>
+          <w:sz w:val="22"/>
+          <w:szCs w:val="22"/>
+        </w:rPr>
+        <w:t>x_n</w:t>
+      </w:r>
+      <w:proofErr w:type="spellEnd"/>
+      <w:r>
+        <w:rPr>
+          <w:rFonts w:ascii="Calibri" w:eastAsia="Calibri" w:hAnsi="Calibri" w:cs="Calibri"/>
+          <w:sz w:val="22"/>
+          <w:szCs w:val="22"/>
+        </w:rPr>
+        <w:t xml:space="preserve"> &gt; 1.9.</w:t>
       </w:r>
     </w:p>
     <w:p>
@@ -2659,7 +5727,79 @@
           <w:sz w:val="22"/>
           <w:szCs w:val="22"/>
         </w:rPr>
-        <w:t>c) (3 pts) Sin ejecutar Python, prediga si la expresión -x_n ** 2 (para x_n negativo) da el mismo resultado que (-x_n) ** 2, y justifique con la regla de precedencia de operadores unarios frente a **.</w:t>
+        <w:t xml:space="preserve">c) (3 </w:t>
+      </w:r>
+      <w:proofErr w:type="spellStart"/>
+      <w:r>
+        <w:rPr>
+          <w:rFonts w:ascii="Calibri" w:eastAsia="Calibri" w:hAnsi="Calibri" w:cs="Calibri"/>
+          <w:sz w:val="22"/>
+          <w:szCs w:val="22"/>
+        </w:rPr>
+        <w:t>pts</w:t>
+      </w:r>
+      <w:proofErr w:type="spellEnd"/>
+      <w:r>
+        <w:rPr>
+          <w:rFonts w:ascii="Calibri" w:eastAsia="Calibri" w:hAnsi="Calibri" w:cs="Calibri"/>
+          <w:sz w:val="22"/>
+          <w:szCs w:val="22"/>
+        </w:rPr>
+        <w:t>) Sin ejecutar Python, prediga si la expresión -</w:t>
+      </w:r>
+      <w:proofErr w:type="spellStart"/>
+      <w:r>
+        <w:rPr>
+          <w:rFonts w:ascii="Calibri" w:eastAsia="Calibri" w:hAnsi="Calibri" w:cs="Calibri"/>
+          <w:sz w:val="22"/>
+          <w:szCs w:val="22"/>
+        </w:rPr>
+        <w:t>x_n</w:t>
+      </w:r>
+      <w:proofErr w:type="spellEnd"/>
+      <w:r>
+        <w:rPr>
+          <w:rFonts w:ascii="Calibri" w:eastAsia="Calibri" w:hAnsi="Calibri" w:cs="Calibri"/>
+          <w:sz w:val="22"/>
+          <w:szCs w:val="22"/>
+        </w:rPr>
+        <w:t xml:space="preserve"> ** 2 (para </w:t>
+      </w:r>
+      <w:proofErr w:type="spellStart"/>
+      <w:r>
+        <w:rPr>
+          <w:rFonts w:ascii="Calibri" w:eastAsia="Calibri" w:hAnsi="Calibri" w:cs="Calibri"/>
+          <w:sz w:val="22"/>
+          <w:szCs w:val="22"/>
+        </w:rPr>
+        <w:t>x_n</w:t>
+      </w:r>
+      <w:proofErr w:type="spellEnd"/>
+      <w:r>
+        <w:rPr>
+          <w:rFonts w:ascii="Calibri" w:eastAsia="Calibri" w:hAnsi="Calibri" w:cs="Calibri"/>
+          <w:sz w:val="22"/>
+          <w:szCs w:val="22"/>
+        </w:rPr>
+        <w:t xml:space="preserve"> negativo) da el mismo resultado que (-</w:t>
+      </w:r>
+      <w:proofErr w:type="spellStart"/>
+      <w:r>
+        <w:rPr>
+          <w:rFonts w:ascii="Calibri" w:eastAsia="Calibri" w:hAnsi="Calibri" w:cs="Calibri"/>
+          <w:sz w:val="22"/>
+          <w:szCs w:val="22"/>
+        </w:rPr>
+        <w:t>x_n</w:t>
+      </w:r>
+      <w:proofErr w:type="spellEnd"/>
+      <w:r>
+        <w:rPr>
+          <w:rFonts w:ascii="Calibri" w:eastAsia="Calibri" w:hAnsi="Calibri" w:cs="Calibri"/>
+          <w:sz w:val="22"/>
+          <w:szCs w:val="22"/>
+        </w:rPr>
+        <w:t>) ** 2, y justifique con la regla de precedencia de operadores unarios frente a **.</w:t>
       </w:r>
     </w:p>
     <w:p>
@@ -2698,6 +5838,119 @@
 <file path=word/numbering.xml><?xml version="1.0" encoding="utf-8"?>
 <w:numbering xmlns:wpc="http://schemas.microsoft.com/office/word/2010/wordprocessingCanvas" xmlns:cx="http://schemas.microsoft.com/office/drawing/2014/chartex" xmlns:cx1="http://schemas.microsoft.com/office/drawing/2015/9/8/chartex" xmlns:cx2="http://schemas.microsoft.com/office/drawing/2015/10/21/chartex" xmlns:cx3="http://schemas.microsoft.com/office/drawing/2016/5/9/chartex" xmlns:cx4="http://schemas.microsoft.com/office/drawing/2016/5/10/chartex" xmlns:cx5="http://schemas.microsoft.com/office/drawing/2016/5/11/chartex" xmlns:cx6="http://schemas.microsoft.com/office/drawing/2016/5/12/chartex" xmlns:cx7="http://schemas.microsoft.com/office/drawing/2016/5/13/chartex" xmlns:cx8="http://schemas.microsoft.com/office/drawing/2016/5/14/chartex" xmlns:mc="http://schemas.openxmlformats.org/markup-compatibility/2006" xmlns:aink="http://schemas.microsoft.com/office/drawing/2016/ink" xmlns:am3d="http://schemas.microsoft.com/office/drawing/2017/model3d" xmlns:o="urn:schemas-microsoft-com:office:office" xmlns:oel="http://schemas.microsoft.com/office/2019/extlst" xmlns:r="http://schemas.openxmlformats.org/officeDocument/2006/relationships" xmlns:m="http://schemas.openxmlformats.org/officeDocument/2006/math" xmlns:v="urn:schemas-microsoft-com:vml" xmlns:wp14="http://schemas.microsoft.com/office/word/2010/wordprocessingDrawing" xmlns:wp="http://schemas.openxmlformats.org/drawingml/2006/wordprocessingDrawing" xmlns:w10="urn:schemas-microsoft-com:office:word" xmlns:w="http://schemas.openxmlformats.org/wordprocessingml/2006/main" xmlns:w14="http://schemas.microsoft.com/office/word/2010/wordml" xmlns:w15="http://schemas.microsoft.com/office/word/2012/wordml" xmlns:w16cex="http://schemas.microsoft.com/office/word/2018/wordml/cex" xmlns:w16cid="http://schemas.microsoft.com/office/word/2016/wordml/cid" xmlns:w16="http://schemas.microsoft.com/office/word/2018/wordml" xmlns:w16du="http://schemas.microsoft.com/office/word/2023/wordml/word16du" xmlns:w16sdtdh="http://schemas.microsoft.com/office/word/2020/wordml/sdtdatahash" xmlns:w16sdtfl="http://schemas.microsoft.com/office/word/2024/wordml/sdtformatlock" xmlns:w16se="http://schemas.microsoft.com/office/word/2015/wordml/symex" xmlns:wpg="http://schemas.microsoft.com/office/word/2010/wordprocessingGroup" xmlns:wpi="http://schemas.microsoft.com/office/word/2010/wordprocessingInk" xmlns:wne="http://schemas.microsoft.com/office/word/2006/wordml" xmlns:wps="http://schemas.microsoft.com/office/word/2010/wordprocessingShape" mc:Ignorable="w14 w15 w16se w16cid w16 w16cex w16sdtdh w16sdtfl w16du wp14">
   <w:abstractNum w:abstractNumId="0" w15:restartNumberingAfterBreak="0">
+    <w:nsid w:val="01153DB6"/>
+    <w:multiLevelType w:val="multilevel"/>
+    <w:tmpl w:val="5BC891AE"/>
+    <w:lvl w:ilvl="0">
+      <w:start w:val="1"/>
+      <w:numFmt w:val="decimal"/>
+      <w:lvlText w:val="%1."/>
+      <w:lvlJc w:val="left"/>
+      <w:pPr>
+        <w:tabs>
+          <w:tab w:val="num" w:pos="720"/>
+        </w:tabs>
+        <w:ind w:left="720" w:hanging="360"/>
+      </w:pPr>
+    </w:lvl>
+    <w:lvl w:ilvl="1" w:tentative="1">
+      <w:start w:val="1"/>
+      <w:numFmt w:val="decimal"/>
+      <w:lvlText w:val="%2."/>
+      <w:lvlJc w:val="left"/>
+      <w:pPr>
+        <w:tabs>
+          <w:tab w:val="num" w:pos="1440"/>
+        </w:tabs>
+        <w:ind w:left="1440" w:hanging="360"/>
+      </w:pPr>
+    </w:lvl>
+    <w:lvl w:ilvl="2" w:tentative="1">
+      <w:start w:val="1"/>
+      <w:numFmt w:val="decimal"/>
+      <w:lvlText w:val="%3."/>
+      <w:lvlJc w:val="left"/>
+      <w:pPr>
+        <w:tabs>
+          <w:tab w:val="num" w:pos="2160"/>
+        </w:tabs>
+        <w:ind w:left="2160" w:hanging="360"/>
+      </w:pPr>
+    </w:lvl>
+    <w:lvl w:ilvl="3" w:tentative="1">
+      <w:start w:val="1"/>
+      <w:numFmt w:val="decimal"/>
+      <w:lvlText w:val="%4."/>
+      <w:lvlJc w:val="left"/>
+      <w:pPr>
+        <w:tabs>
+          <w:tab w:val="num" w:pos="2880"/>
+        </w:tabs>
+        <w:ind w:left="2880" w:hanging="360"/>
+      </w:pPr>
+    </w:lvl>
+    <w:lvl w:ilvl="4" w:tentative="1">
+      <w:start w:val="1"/>
+      <w:numFmt w:val="decimal"/>
+      <w:lvlText w:val="%5."/>
+      <w:lvlJc w:val="left"/>
+      <w:pPr>
+        <w:tabs>
+          <w:tab w:val="num" w:pos="3600"/>
+        </w:tabs>
+        <w:ind w:left="3600" w:hanging="360"/>
+      </w:pPr>
+    </w:lvl>
+    <w:lvl w:ilvl="5" w:tentative="1">
+      <w:start w:val="1"/>
+      <w:numFmt w:val="decimal"/>
+      <w:lvlText w:val="%6."/>
+      <w:lvlJc w:val="left"/>
+      <w:pPr>
+        <w:tabs>
+          <w:tab w:val="num" w:pos="4320"/>
+        </w:tabs>
+        <w:ind w:left="4320" w:hanging="360"/>
+      </w:pPr>
+    </w:lvl>
+    <w:lvl w:ilvl="6" w:tentative="1">
+      <w:start w:val="1"/>
+      <w:numFmt w:val="decimal"/>
+      <w:lvlText w:val="%7."/>
+      <w:lvlJc w:val="left"/>
+      <w:pPr>
+        <w:tabs>
+          <w:tab w:val="num" w:pos="5040"/>
+        </w:tabs>
+        <w:ind w:left="5040" w:hanging="360"/>
+      </w:pPr>
+    </w:lvl>
+    <w:lvl w:ilvl="7" w:tentative="1">
+      <w:start w:val="1"/>
+      <w:numFmt w:val="decimal"/>
+      <w:lvlText w:val="%8."/>
+      <w:lvlJc w:val="left"/>
+      <w:pPr>
+        <w:tabs>
+          <w:tab w:val="num" w:pos="5760"/>
+        </w:tabs>
+        <w:ind w:left="5760" w:hanging="360"/>
+      </w:pPr>
+    </w:lvl>
+    <w:lvl w:ilvl="8" w:tentative="1">
+      <w:start w:val="1"/>
+      <w:numFmt w:val="decimal"/>
+      <w:lvlText w:val="%9."/>
+      <w:lvlJc w:val="left"/>
+      <w:pPr>
+        <w:tabs>
+          <w:tab w:val="num" w:pos="6480"/>
+        </w:tabs>
+        <w:ind w:left="6480" w:hanging="360"/>
+      </w:pPr>
+    </w:lvl>
+  </w:abstractNum>
+  <w:abstractNum w:abstractNumId="1" w15:restartNumberingAfterBreak="0">
     <w:nsid w:val="39F07E14"/>
     <w:multiLevelType w:val="hybridMultilevel"/>
     <w:tmpl w:val="E2F6A81A"/>
@@ -2783,7 +6036,156 @@
       </w:pPr>
     </w:lvl>
   </w:abstractNum>
-  <w:abstractNum w:abstractNumId="1" w15:restartNumberingAfterBreak="0">
+  <w:abstractNum w:abstractNumId="2" w15:restartNumberingAfterBreak="0">
+    <w:nsid w:val="46821E14"/>
+    <w:multiLevelType w:val="multilevel"/>
+    <w:tmpl w:val="3340AC94"/>
+    <w:lvl w:ilvl="0">
+      <w:start w:val="1"/>
+      <w:numFmt w:val="bullet"/>
+      <w:lvlText w:val=""/>
+      <w:lvlJc w:val="left"/>
+      <w:pPr>
+        <w:tabs>
+          <w:tab w:val="num" w:pos="720"/>
+        </w:tabs>
+        <w:ind w:left="720" w:hanging="360"/>
+      </w:pPr>
+      <w:rPr>
+        <w:rFonts w:ascii="Symbol" w:hAnsi="Symbol" w:hint="default"/>
+        <w:sz w:val="20"/>
+      </w:rPr>
+    </w:lvl>
+    <w:lvl w:ilvl="1" w:tentative="1">
+      <w:start w:val="1"/>
+      <w:numFmt w:val="bullet"/>
+      <w:lvlText w:val="o"/>
+      <w:lvlJc w:val="left"/>
+      <w:pPr>
+        <w:tabs>
+          <w:tab w:val="num" w:pos="1440"/>
+        </w:tabs>
+        <w:ind w:left="1440" w:hanging="360"/>
+      </w:pPr>
+      <w:rPr>
+        <w:rFonts w:ascii="Courier New" w:hAnsi="Courier New" w:hint="default"/>
+        <w:sz w:val="20"/>
+      </w:rPr>
+    </w:lvl>
+    <w:lvl w:ilvl="2" w:tentative="1">
+      <w:start w:val="1"/>
+      <w:numFmt w:val="bullet"/>
+      <w:lvlText w:val=""/>
+      <w:lvlJc w:val="left"/>
+      <w:pPr>
+        <w:tabs>
+          <w:tab w:val="num" w:pos="2160"/>
+        </w:tabs>
+        <w:ind w:left="2160" w:hanging="360"/>
+      </w:pPr>
+      <w:rPr>
+        <w:rFonts w:ascii="Wingdings" w:hAnsi="Wingdings" w:hint="default"/>
+        <w:sz w:val="20"/>
+      </w:rPr>
+    </w:lvl>
+    <w:lvl w:ilvl="3" w:tentative="1">
+      <w:start w:val="1"/>
+      <w:numFmt w:val="bullet"/>
+      <w:lvlText w:val=""/>
+      <w:lvlJc w:val="left"/>
+      <w:pPr>
+        <w:tabs>
+          <w:tab w:val="num" w:pos="2880"/>
+        </w:tabs>
+        <w:ind w:left="2880" w:hanging="360"/>
+      </w:pPr>
+      <w:rPr>
+        <w:rFonts w:ascii="Wingdings" w:hAnsi="Wingdings" w:hint="default"/>
+        <w:sz w:val="20"/>
+      </w:rPr>
+    </w:lvl>
+    <w:lvl w:ilvl="4" w:tentative="1">
+      <w:start w:val="1"/>
+      <w:numFmt w:val="bullet"/>
+      <w:lvlText w:val=""/>
+      <w:lvlJc w:val="left"/>
+      <w:pPr>
+        <w:tabs>
+          <w:tab w:val="num" w:pos="3600"/>
+        </w:tabs>
+        <w:ind w:left="3600" w:hanging="360"/>
+      </w:pPr>
+      <w:rPr>
+        <w:rFonts w:ascii="Wingdings" w:hAnsi="Wingdings" w:hint="default"/>
+        <w:sz w:val="20"/>
+      </w:rPr>
+    </w:lvl>
+    <w:lvl w:ilvl="5" w:tentative="1">
+      <w:start w:val="1"/>
+      <w:numFmt w:val="bullet"/>
+      <w:lvlText w:val=""/>
+      <w:lvlJc w:val="left"/>
+      <w:pPr>
+        <w:tabs>
+          <w:tab w:val="num" w:pos="4320"/>
+        </w:tabs>
+        <w:ind w:left="4320" w:hanging="360"/>
+      </w:pPr>
+      <w:rPr>
+        <w:rFonts w:ascii="Wingdings" w:hAnsi="Wingdings" w:hint="default"/>
+        <w:sz w:val="20"/>
+      </w:rPr>
+    </w:lvl>
+    <w:lvl w:ilvl="6" w:tentative="1">
+      <w:start w:val="1"/>
+      <w:numFmt w:val="bullet"/>
+      <w:lvlText w:val=""/>
+      <w:lvlJc w:val="left"/>
+      <w:pPr>
+        <w:tabs>
+          <w:tab w:val="num" w:pos="5040"/>
+        </w:tabs>
+        <w:ind w:left="5040" w:hanging="360"/>
+      </w:pPr>
+      <w:rPr>
+        <w:rFonts w:ascii="Wingdings" w:hAnsi="Wingdings" w:hint="default"/>
+        <w:sz w:val="20"/>
+      </w:rPr>
+    </w:lvl>
+    <w:lvl w:ilvl="7" w:tentative="1">
+      <w:start w:val="1"/>
+      <w:numFmt w:val="bullet"/>
+      <w:lvlText w:val=""/>
+      <w:lvlJc w:val="left"/>
+      <w:pPr>
+        <w:tabs>
+          <w:tab w:val="num" w:pos="5760"/>
+        </w:tabs>
+        <w:ind w:left="5760" w:hanging="360"/>
+      </w:pPr>
+      <w:rPr>
+        <w:rFonts w:ascii="Wingdings" w:hAnsi="Wingdings" w:hint="default"/>
+        <w:sz w:val="20"/>
+      </w:rPr>
+    </w:lvl>
+    <w:lvl w:ilvl="8" w:tentative="1">
+      <w:start w:val="1"/>
+      <w:numFmt w:val="bullet"/>
+      <w:lvlText w:val=""/>
+      <w:lvlJc w:val="left"/>
+      <w:pPr>
+        <w:tabs>
+          <w:tab w:val="num" w:pos="6480"/>
+        </w:tabs>
+        <w:ind w:left="6480" w:hanging="360"/>
+      </w:pPr>
+      <w:rPr>
+        <w:rFonts w:ascii="Wingdings" w:hAnsi="Wingdings" w:hint="default"/>
+        <w:sz w:val="20"/>
+      </w:rPr>
+    </w:lvl>
+  </w:abstractNum>
+  <w:abstractNum w:abstractNumId="3" w15:restartNumberingAfterBreak="0">
     <w:nsid w:val="694835BA"/>
     <w:multiLevelType w:val="hybridMultilevel"/>
     <w:tmpl w:val="A32A09C0"/>
@@ -2837,17 +6239,175 @@
       <w:lvlJc w:val="left"/>
     </w:lvl>
   </w:abstractNum>
+  <w:abstractNum w:abstractNumId="4" w15:restartNumberingAfterBreak="0">
+    <w:nsid w:val="799E650D"/>
+    <w:multiLevelType w:val="multilevel"/>
+    <w:tmpl w:val="FFAE6C76"/>
+    <w:lvl w:ilvl="0">
+      <w:start w:val="1"/>
+      <w:numFmt w:val="bullet"/>
+      <w:lvlText w:val=""/>
+      <w:lvlJc w:val="left"/>
+      <w:pPr>
+        <w:tabs>
+          <w:tab w:val="num" w:pos="720"/>
+        </w:tabs>
+        <w:ind w:left="720" w:hanging="360"/>
+      </w:pPr>
+      <w:rPr>
+        <w:rFonts w:ascii="Symbol" w:hAnsi="Symbol" w:hint="default"/>
+        <w:sz w:val="20"/>
+      </w:rPr>
+    </w:lvl>
+    <w:lvl w:ilvl="1" w:tentative="1">
+      <w:start w:val="1"/>
+      <w:numFmt w:val="bullet"/>
+      <w:lvlText w:val="o"/>
+      <w:lvlJc w:val="left"/>
+      <w:pPr>
+        <w:tabs>
+          <w:tab w:val="num" w:pos="1440"/>
+        </w:tabs>
+        <w:ind w:left="1440" w:hanging="360"/>
+      </w:pPr>
+      <w:rPr>
+        <w:rFonts w:ascii="Courier New" w:hAnsi="Courier New" w:hint="default"/>
+        <w:sz w:val="20"/>
+      </w:rPr>
+    </w:lvl>
+    <w:lvl w:ilvl="2" w:tentative="1">
+      <w:start w:val="1"/>
+      <w:numFmt w:val="bullet"/>
+      <w:lvlText w:val=""/>
+      <w:lvlJc w:val="left"/>
+      <w:pPr>
+        <w:tabs>
+          <w:tab w:val="num" w:pos="2160"/>
+        </w:tabs>
+        <w:ind w:left="2160" w:hanging="360"/>
+      </w:pPr>
+      <w:rPr>
+        <w:rFonts w:ascii="Wingdings" w:hAnsi="Wingdings" w:hint="default"/>
+        <w:sz w:val="20"/>
+      </w:rPr>
+    </w:lvl>
+    <w:lvl w:ilvl="3" w:tentative="1">
+      <w:start w:val="1"/>
+      <w:numFmt w:val="bullet"/>
+      <w:lvlText w:val=""/>
+      <w:lvlJc w:val="left"/>
+      <w:pPr>
+        <w:tabs>
+          <w:tab w:val="num" w:pos="2880"/>
+        </w:tabs>
+        <w:ind w:left="2880" w:hanging="360"/>
+      </w:pPr>
+      <w:rPr>
+        <w:rFonts w:ascii="Wingdings" w:hAnsi="Wingdings" w:hint="default"/>
+        <w:sz w:val="20"/>
+      </w:rPr>
+    </w:lvl>
+    <w:lvl w:ilvl="4" w:tentative="1">
+      <w:start w:val="1"/>
+      <w:numFmt w:val="bullet"/>
+      <w:lvlText w:val=""/>
+      <w:lvlJc w:val="left"/>
+      <w:pPr>
+        <w:tabs>
+          <w:tab w:val="num" w:pos="3600"/>
+        </w:tabs>
+        <w:ind w:left="3600" w:hanging="360"/>
+      </w:pPr>
+      <w:rPr>
+        <w:rFonts w:ascii="Wingdings" w:hAnsi="Wingdings" w:hint="default"/>
+        <w:sz w:val="20"/>
+      </w:rPr>
+    </w:lvl>
+    <w:lvl w:ilvl="5" w:tentative="1">
+      <w:start w:val="1"/>
+      <w:numFmt w:val="bullet"/>
+      <w:lvlText w:val=""/>
+      <w:lvlJc w:val="left"/>
+      <w:pPr>
+        <w:tabs>
+          <w:tab w:val="num" w:pos="4320"/>
+        </w:tabs>
+        <w:ind w:left="4320" w:hanging="360"/>
+      </w:pPr>
+      <w:rPr>
+        <w:rFonts w:ascii="Wingdings" w:hAnsi="Wingdings" w:hint="default"/>
+        <w:sz w:val="20"/>
+      </w:rPr>
+    </w:lvl>
+    <w:lvl w:ilvl="6" w:tentative="1">
+      <w:start w:val="1"/>
+      <w:numFmt w:val="bullet"/>
+      <w:lvlText w:val=""/>
+      <w:lvlJc w:val="left"/>
+      <w:pPr>
+        <w:tabs>
+          <w:tab w:val="num" w:pos="5040"/>
+        </w:tabs>
+        <w:ind w:left="5040" w:hanging="360"/>
+      </w:pPr>
+      <w:rPr>
+        <w:rFonts w:ascii="Wingdings" w:hAnsi="Wingdings" w:hint="default"/>
+        <w:sz w:val="20"/>
+      </w:rPr>
+    </w:lvl>
+    <w:lvl w:ilvl="7" w:tentative="1">
+      <w:start w:val="1"/>
+      <w:numFmt w:val="bullet"/>
+      <w:lvlText w:val=""/>
+      <w:lvlJc w:val="left"/>
+      <w:pPr>
+        <w:tabs>
+          <w:tab w:val="num" w:pos="5760"/>
+        </w:tabs>
+        <w:ind w:left="5760" w:hanging="360"/>
+      </w:pPr>
+      <w:rPr>
+        <w:rFonts w:ascii="Wingdings" w:hAnsi="Wingdings" w:hint="default"/>
+        <w:sz w:val="20"/>
+      </w:rPr>
+    </w:lvl>
+    <w:lvl w:ilvl="8" w:tentative="1">
+      <w:start w:val="1"/>
+      <w:numFmt w:val="bullet"/>
+      <w:lvlText w:val=""/>
+      <w:lvlJc w:val="left"/>
+      <w:pPr>
+        <w:tabs>
+          <w:tab w:val="num" w:pos="6480"/>
+        </w:tabs>
+        <w:ind w:left="6480" w:hanging="360"/>
+      </w:pPr>
+      <w:rPr>
+        <w:rFonts w:ascii="Wingdings" w:hAnsi="Wingdings" w:hint="default"/>
+        <w:sz w:val="20"/>
+      </w:rPr>
+    </w:lvl>
+  </w:abstractNum>
   <w:num w:numId="1" w16cid:durableId="1399548869">
-    <w:abstractNumId w:val="0"/>
+    <w:abstractNumId w:val="1"/>
     <w:lvlOverride w:ilvl="0">
       <w:startOverride w:val="1"/>
     </w:lvlOverride>
   </w:num>
   <w:num w:numId="2" w16cid:durableId="1067071718">
-    <w:abstractNumId w:val="1"/>
+    <w:abstractNumId w:val="3"/>
     <w:lvlOverride w:ilvl="0">
       <w:startOverride w:val="1"/>
     </w:lvlOverride>
+  </w:num>
+  <w:num w:numId="3" w16cid:durableId="808136444">
+    <w:abstractNumId w:val="4"/>
+  </w:num>
+  <w:num w:numId="4" w16cid:durableId="312493565">
+    <w:abstractNumId w:val="2"/>
+  </w:num>
+  <w:num w:numId="5" w16cid:durableId="831019210">
+    <w:abstractNumId w:val="0"/>
   </w:num>
 </w:numbering>
 </file>
@@ -3331,7 +6891,6 @@
   <w:style w:type="character" w:default="1" w:styleId="Fuentedeprrafopredeter">
     <w:name w:val="Default Paragraph Font"/>
     <w:uiPriority w:val="1"/>
-    <w:semiHidden/>
     <w:unhideWhenUsed/>
   </w:style>
   <w:style w:type="table" w:default="1" w:styleId="Tablanormal">

</xml_diff>